<commit_message>
Landing de CV one-page con sistema de diseño del proyecto
- CV.md: arquitectura de información convertida desde ARQUITECTURA-CV.docx
- index.html: hero, sobre mí, proyectos por área y contacto en una sola página
- cv.css / cv.js: tokens de DESIGN.md, preloader, carruseles, cursor
- Videos UX/UI integrados; imágenes campaña renombradas a ASCII
</commit_message>
<xml_diff>
--- a/ARQUITECTURA-CV.docx
+++ b/ARQUITECTURA-CV.docx
@@ -5,21 +5,23 @@
     <w:p>
       <w:pPr>
         <w:rPr>
+          <w:rFonts w:ascii="Aptos" w:hAnsi="Aptos"/>
           <w:b/>
           <w:bCs/>
           <w:color w:val="6A7AE8"/>
-          <w:sz w:val="40"/>
-          <w:szCs w:val="40"/>
+          <w:sz w:val="36"/>
+          <w:szCs w:val="36"/>
           <w:lang w:val="es-ES_tradnl"/>
         </w:rPr>
       </w:pPr>
       <w:r>
         <w:rPr>
+          <w:rFonts w:ascii="Aptos" w:hAnsi="Aptos"/>
           <w:b/>
           <w:bCs/>
           <w:color w:val="6A7AE8"/>
-          <w:sz w:val="40"/>
-          <w:szCs w:val="40"/>
+          <w:sz w:val="36"/>
+          <w:szCs w:val="36"/>
           <w:lang w:val="es-ES_tradnl"/>
         </w:rPr>
         <w:t xml:space="preserve">Mi </w:t>
@@ -27,11 +29,12 @@
       <w:proofErr w:type="spellStart"/>
       <w:r>
         <w:rPr>
+          <w:rFonts w:ascii="Aptos" w:hAnsi="Aptos"/>
           <w:b/>
           <w:bCs/>
           <w:color w:val="6A7AE8"/>
-          <w:sz w:val="40"/>
-          <w:szCs w:val="40"/>
+          <w:sz w:val="36"/>
+          <w:szCs w:val="36"/>
           <w:lang w:val="es-ES_tradnl"/>
         </w:rPr>
         <w:t>Landing</w:t>
@@ -39,11 +42,12 @@
       <w:proofErr w:type="spellEnd"/>
       <w:r>
         <w:rPr>
+          <w:rFonts w:ascii="Aptos" w:hAnsi="Aptos"/>
           <w:b/>
           <w:bCs/>
           <w:color w:val="6A7AE8"/>
-          <w:sz w:val="40"/>
-          <w:szCs w:val="40"/>
+          <w:sz w:val="36"/>
+          <w:szCs w:val="36"/>
           <w:lang w:val="es-ES_tradnl"/>
         </w:rPr>
         <w:t xml:space="preserve"> de CV</w:t>
@@ -53,53 +57,161 @@
       <w:pPr>
         <w:spacing w:after="60"/>
         <w:rPr>
-          <w:rFonts w:ascii="Aptos" w:hAnsi="Aptos"/>
-        </w:rPr>
-      </w:pPr>
-      <w:r>
-        <w:rPr>
           <w:rFonts w:ascii="Aptos" w:eastAsia="Calibri" w:hAnsi="Aptos" w:cs="Calibri"/>
           <w:b/>
           <w:bCs/>
           <w:color w:val="202225"/>
+          <w:sz w:val="22"/>
+          <w:szCs w:val="22"/>
+        </w:rPr>
+      </w:pPr>
+      <w:r>
+        <w:rPr>
+          <w:rFonts w:ascii="Aptos" w:eastAsia="Calibri" w:hAnsi="Aptos" w:cs="Calibri"/>
+          <w:b/>
+          <w:bCs/>
+          <w:color w:val="202225"/>
+          <w:sz w:val="22"/>
+          <w:szCs w:val="22"/>
         </w:rPr>
         <w:t>Arquitectura de información, diseño y contenido — en lenguaje natural</w:t>
       </w:r>
     </w:p>
     <w:p>
       <w:pPr>
+        <w:spacing w:after="320"/>
+        <w:rPr>
+          <w:rFonts w:ascii="Aptos" w:hAnsi="Aptos"/>
+          <w:sz w:val="22"/>
+          <w:szCs w:val="22"/>
+        </w:rPr>
+      </w:pPr>
+      <w:r>
+        <w:rPr>
+          <w:rFonts w:ascii="Aptos" w:eastAsia="Calibri" w:hAnsi="Aptos"/>
+          <w:i/>
+          <w:color w:val="424A93"/>
+          <w:sz w:val="22"/>
+          <w:szCs w:val="22"/>
+        </w:rPr>
+        <w:t>Documento complementario a DESIGN.md · El contenido define qué va y en qué orden; DESIGN.md gobierna cómo se ve.</w:t>
+      </w:r>
+    </w:p>
+    <w:p>
+      <w:pPr>
+        <w:rPr>
+          <w:rFonts w:ascii="Aptos" w:eastAsia="Calibri" w:hAnsi="Aptos"/>
+          <w:color w:val="202225"/>
+          <w:sz w:val="22"/>
+          <w:szCs w:val="22"/>
+        </w:rPr>
+      </w:pPr>
+      <w:r>
+        <w:rPr>
+          <w:rFonts w:ascii="Aptos" w:eastAsia="Calibri" w:hAnsi="Aptos"/>
+          <w:color w:val="202225"/>
+          <w:sz w:val="22"/>
+          <w:szCs w:val="22"/>
+        </w:rPr>
+        <w:t>Este documento define la arquitectura de información, el contenido, el orden, los enlaces y el comportamiento funcional. Los colores, tipografías, dimensiones, sombras, formas y demás decisiones visuales se toman únicamente de DESIGN.md.</w:t>
+      </w:r>
+      <w:r>
+        <w:rPr>
+          <w:rFonts w:ascii="Aptos" w:eastAsia="Calibri" w:hAnsi="Aptos"/>
+          <w:color w:val="202225"/>
+          <w:sz w:val="22"/>
+          <w:szCs w:val="22"/>
+        </w:rPr>
+        <w:t xml:space="preserve"> </w:t>
+      </w:r>
+    </w:p>
+    <w:p>
+      <w:pPr>
+        <w:pStyle w:val="Listaconvietas"/>
+        <w:rPr>
+          <w:rFonts w:ascii="Aptos" w:hAnsi="Aptos"/>
+          <w:lang w:val="es-MX"/>
+        </w:rPr>
+      </w:pPr>
+      <w:r>
+        <w:rPr>
+          <w:rFonts w:ascii="Aptos" w:eastAsia="Calibri" w:hAnsi="Aptos"/>
+          <w:b/>
+          <w:lang w:val="es-MX"/>
+        </w:rPr>
+        <w:t>Salida esperada:</w:t>
+      </w:r>
+      <w:r>
+        <w:rPr>
+          <w:rFonts w:ascii="Aptos" w:eastAsia="Calibri" w:hAnsi="Aptos"/>
+          <w:lang w:val="es-MX"/>
+        </w:rPr>
+        <w:t xml:space="preserve"> un archivo CV.md y una sola landing responsiva en un único HTML.</w:t>
+      </w:r>
+    </w:p>
+    <w:p>
+      <w:pPr>
+        <w:pStyle w:val="Listaconvietas"/>
+        <w:rPr>
+          <w:rFonts w:ascii="Aptos" w:hAnsi="Aptos"/>
+          <w:lang w:val="es-MX"/>
+        </w:rPr>
+      </w:pPr>
+      <w:r>
+        <w:rPr>
+          <w:rFonts w:ascii="Aptos" w:eastAsia="Calibri" w:hAnsi="Aptos"/>
+          <w:b/>
+          <w:lang w:val="es-MX"/>
+        </w:rPr>
+        <w:t>No crear:</w:t>
+      </w:r>
+      <w:r>
+        <w:rPr>
+          <w:rFonts w:ascii="Aptos" w:eastAsia="Calibri" w:hAnsi="Aptos"/>
+          <w:lang w:val="es-MX"/>
+        </w:rPr>
+        <w:t xml:space="preserve"> una página adicional de Proyectos, páginas separadas por proyecto ni un preloader entre secciones.</w:t>
+      </w:r>
+    </w:p>
+    <w:p>
+      <w:pPr>
         <w:spacing w:after="60"/>
         <w:rPr>
           <w:rFonts w:ascii="Aptos" w:hAnsi="Aptos"/>
-        </w:rPr>
-      </w:pPr>
-    </w:p>
-    <w:p>
-      <w:pPr>
-        <w:rPr>
-          <w:b/>
-          <w:bCs/>
-          <w:sz w:val="32"/>
-          <w:szCs w:val="32"/>
+          <w:sz w:val="22"/>
+          <w:szCs w:val="22"/>
+        </w:rPr>
+      </w:pPr>
+    </w:p>
+    <w:p>
+      <w:pPr>
+        <w:rPr>
+          <w:rFonts w:ascii="Aptos" w:hAnsi="Aptos"/>
+          <w:b/>
+          <w:bCs/>
+          <w:sz w:val="22"/>
+          <w:szCs w:val="22"/>
           <w:lang w:val="es-ES_tradnl"/>
         </w:rPr>
       </w:pPr>
       <w:r>
         <w:rPr>
-          <w:b/>
-          <w:bCs/>
-          <w:sz w:val="32"/>
-          <w:szCs w:val="32"/>
+          <w:rFonts w:ascii="Aptos" w:hAnsi="Aptos"/>
+          <w:b/>
+          <w:bCs/>
+          <w:sz w:val="22"/>
+          <w:szCs w:val="22"/>
           <w:lang w:val="es-ES_tradnl"/>
         </w:rPr>
         <w:t xml:space="preserve">1. </w:t>
       </w:r>
       <w:r>
         <w:rPr>
-          <w:b/>
-          <w:bCs/>
-          <w:sz w:val="32"/>
-          <w:szCs w:val="32"/>
+          <w:rFonts w:ascii="Aptos" w:hAnsi="Aptos"/>
+          <w:b/>
+          <w:bCs/>
+          <w:sz w:val="22"/>
+          <w:szCs w:val="22"/>
           <w:lang w:val="es-ES_tradnl"/>
         </w:rPr>
         <w:t>Estructura general y navegación</w:t>
@@ -108,854 +220,1405 @@
     <w:p>
       <w:pPr>
         <w:rPr>
+          <w:rFonts w:ascii="Aptos" w:hAnsi="Aptos"/>
+          <w:sz w:val="22"/>
+          <w:szCs w:val="22"/>
+        </w:rPr>
+      </w:pPr>
+      <w:r>
+        <w:rPr>
+          <w:rFonts w:ascii="Aptos" w:hAnsi="Aptos"/>
           <w:sz w:val="22"/>
           <w:szCs w:val="22"/>
           <w:lang w:val="es-ES_tradnl"/>
         </w:rPr>
-      </w:pPr>
-      <w:r>
-        <w:rPr>
+        <w:t xml:space="preserve">Mi CV es una </w:t>
+      </w:r>
+      <w:r>
+        <w:rPr>
+          <w:rFonts w:ascii="Aptos" w:hAnsi="Aptos"/>
           <w:sz w:val="22"/>
           <w:szCs w:val="22"/>
           <w:lang w:val="es-ES_tradnl"/>
         </w:rPr>
-        <w:t xml:space="preserve">Mi CV es una </w:t>
+        <w:t>de una sola página (</w:t>
       </w:r>
       <w:proofErr w:type="spellStart"/>
       <w:r>
         <w:rPr>
+          <w:rFonts w:ascii="Aptos" w:hAnsi="Aptos"/>
           <w:sz w:val="22"/>
           <w:szCs w:val="22"/>
           <w:lang w:val="es-ES_tradnl"/>
         </w:rPr>
-        <w:t>landing</w:t>
+        <w:t>one</w:t>
       </w:r>
       <w:proofErr w:type="spellEnd"/>
       <w:r>
         <w:rPr>
+          <w:rFonts w:ascii="Aptos" w:hAnsi="Aptos"/>
           <w:sz w:val="22"/>
           <w:szCs w:val="22"/>
           <w:lang w:val="es-ES_tradnl"/>
         </w:rPr>
+        <w:t>-page)</w:t>
+      </w:r>
+      <w:r>
+        <w:rPr>
+          <w:rFonts w:ascii="Aptos" w:hAnsi="Aptos"/>
+          <w:sz w:val="22"/>
+          <w:szCs w:val="22"/>
+        </w:rPr>
+        <w:t xml:space="preserve">. </w:t>
+      </w:r>
+      <w:r>
+        <w:rPr>
+          <w:rFonts w:ascii="Aptos" w:hAnsi="Aptos"/>
+          <w:sz w:val="22"/>
+          <w:szCs w:val="22"/>
+        </w:rPr>
+        <w:t>El preloader aparece únicamente durante la carga inicial. El ícono de marca se desplaza hacia arriba y descubre la landing y se queda como en el menú fijo con el</w:t>
+      </w:r>
+      <w:r>
+        <w:rPr>
+          <w:rFonts w:ascii="Aptos" w:hAnsi="Aptos"/>
+          <w:sz w:val="22"/>
+          <w:szCs w:val="22"/>
+        </w:rPr>
+        <w:t xml:space="preserve"> mismo</w:t>
+      </w:r>
+      <w:r>
+        <w:rPr>
+          <w:rFonts w:ascii="Aptos" w:hAnsi="Aptos"/>
+          <w:sz w:val="22"/>
+          <w:szCs w:val="22"/>
+        </w:rPr>
+        <w:t xml:space="preserve"> ícono de mi marca</w:t>
+      </w:r>
+      <w:r>
+        <w:rPr>
+          <w:rFonts w:ascii="Aptos" w:hAnsi="Aptos"/>
+          <w:sz w:val="22"/>
+          <w:szCs w:val="22"/>
+        </w:rPr>
+        <w:t xml:space="preserve"> al centro</w:t>
+      </w:r>
+      <w:r>
+        <w:rPr>
+          <w:rFonts w:ascii="Aptos" w:hAnsi="Aptos"/>
+          <w:sz w:val="22"/>
+          <w:szCs w:val="22"/>
+        </w:rPr>
+        <w:t>; no vuelve a mostrarse al navegar entre secciones.</w:t>
+      </w:r>
+      <w:r>
+        <w:rPr>
+          <w:rFonts w:ascii="Aptos" w:hAnsi="Aptos"/>
+          <w:sz w:val="22"/>
+          <w:szCs w:val="22"/>
+        </w:rPr>
         <w:t xml:space="preserve"> </w:t>
       </w:r>
       <w:r>
         <w:rPr>
+          <w:rFonts w:ascii="Aptos" w:hAnsi="Aptos"/>
+          <w:sz w:val="22"/>
+          <w:szCs w:val="22"/>
+        </w:rPr>
+        <w:t xml:space="preserve">El menú permanece fijo en la parte superior. El ícono de marca lleva a </w:t>
+      </w:r>
+      <w:r>
+        <w:rPr>
+          <w:rFonts w:ascii="Aptos" w:hAnsi="Aptos"/>
+          <w:sz w:val="22"/>
+          <w:szCs w:val="22"/>
+        </w:rPr>
+        <w:t>I</w:t>
+      </w:r>
+      <w:r>
+        <w:rPr>
+          <w:rFonts w:ascii="Aptos" w:hAnsi="Aptos"/>
+          <w:sz w:val="22"/>
+          <w:szCs w:val="22"/>
+        </w:rPr>
+        <w:t xml:space="preserve">nicio y los enlaces llevan a </w:t>
+      </w:r>
+      <w:r>
+        <w:rPr>
+          <w:rFonts w:ascii="Aptos" w:hAnsi="Aptos"/>
+          <w:sz w:val="22"/>
+          <w:szCs w:val="22"/>
+        </w:rPr>
+        <w:t>S</w:t>
+      </w:r>
+      <w:r>
+        <w:rPr>
+          <w:rFonts w:ascii="Aptos" w:hAnsi="Aptos"/>
+          <w:sz w:val="22"/>
+          <w:szCs w:val="22"/>
+        </w:rPr>
+        <w:t>obre</w:t>
+      </w:r>
+      <w:r>
+        <w:rPr>
+          <w:rFonts w:ascii="Aptos" w:hAnsi="Aptos"/>
+          <w:sz w:val="22"/>
+          <w:szCs w:val="22"/>
+        </w:rPr>
+        <w:t xml:space="preserve"> </w:t>
+      </w:r>
+      <w:r>
+        <w:rPr>
+          <w:rFonts w:ascii="Aptos" w:hAnsi="Aptos"/>
+          <w:sz w:val="22"/>
+          <w:szCs w:val="22"/>
+        </w:rPr>
+        <w:t>m</w:t>
+      </w:r>
+      <w:r>
+        <w:rPr>
+          <w:rFonts w:ascii="Aptos" w:hAnsi="Aptos"/>
+          <w:sz w:val="22"/>
+          <w:szCs w:val="22"/>
+        </w:rPr>
+        <w:t>í</w:t>
+      </w:r>
+      <w:r>
+        <w:rPr>
+          <w:rFonts w:ascii="Aptos" w:hAnsi="Aptos"/>
+          <w:sz w:val="22"/>
+          <w:szCs w:val="22"/>
+        </w:rPr>
+        <w:t>,</w:t>
+      </w:r>
+      <w:r>
+        <w:rPr>
+          <w:rFonts w:ascii="Aptos" w:hAnsi="Aptos"/>
+          <w:sz w:val="22"/>
+          <w:szCs w:val="22"/>
+        </w:rPr>
+        <w:t xml:space="preserve"> Mis p</w:t>
+      </w:r>
+      <w:r>
+        <w:rPr>
+          <w:rFonts w:ascii="Aptos" w:hAnsi="Aptos"/>
+          <w:sz w:val="22"/>
+          <w:szCs w:val="22"/>
+        </w:rPr>
+        <w:t xml:space="preserve">royectos y </w:t>
+      </w:r>
+      <w:r>
+        <w:rPr>
+          <w:rFonts w:ascii="Aptos" w:hAnsi="Aptos"/>
+          <w:sz w:val="22"/>
+          <w:szCs w:val="22"/>
+        </w:rPr>
+        <w:t>C</w:t>
+      </w:r>
+      <w:r>
+        <w:rPr>
+          <w:rFonts w:ascii="Aptos" w:hAnsi="Aptos"/>
+          <w:sz w:val="22"/>
+          <w:szCs w:val="22"/>
+        </w:rPr>
+        <w:t>ontacto.</w:t>
+      </w:r>
+      <w:r>
+        <w:rPr>
+          <w:rFonts w:ascii="Aptos" w:hAnsi="Aptos"/>
+          <w:sz w:val="22"/>
+          <w:szCs w:val="22"/>
+        </w:rPr>
+        <w:t xml:space="preserve"> </w:t>
+      </w:r>
+      <w:r>
+        <w:rPr>
+          <w:rFonts w:ascii="Aptos" w:hAnsi="Aptos"/>
+          <w:sz w:val="22"/>
+          <w:szCs w:val="22"/>
+        </w:rPr>
+        <w:t>Todos los enlaces internos realizan un desplazamiento suave dentro del mismo HTML.</w:t>
+      </w:r>
+      <w:r>
+        <w:rPr>
+          <w:rFonts w:ascii="Aptos" w:hAnsi="Aptos"/>
+          <w:sz w:val="22"/>
+          <w:szCs w:val="22"/>
+        </w:rPr>
+        <w:t xml:space="preserve"> </w:t>
+      </w:r>
+    </w:p>
+    <w:p>
+      <w:pPr>
+        <w:rPr>
+          <w:rFonts w:ascii="Aptos" w:hAnsi="Aptos"/>
+          <w:sz w:val="22"/>
+          <w:szCs w:val="22"/>
+        </w:rPr>
+      </w:pPr>
+      <w:r>
+        <w:rPr>
+          <w:rFonts w:ascii="Aptos" w:hAnsi="Aptos"/>
+          <w:sz w:val="22"/>
+          <w:szCs w:val="22"/>
+        </w:rPr>
+        <w:t>El cursor personalizado funciona en escritorio, sigue el movimiento de manera suave y genera un trazo temporal. En dispositivos táctiles se desactiva y se conserva el comportamiento nativo.</w:t>
+      </w:r>
+      <w:r>
+        <w:rPr>
+          <w:rFonts w:ascii="Aptos" w:hAnsi="Aptos"/>
+          <w:sz w:val="22"/>
+          <w:szCs w:val="22"/>
+        </w:rPr>
+        <w:t xml:space="preserve"> </w:t>
+      </w:r>
+      <w:r>
+        <w:rPr>
+          <w:rFonts w:ascii="Aptos" w:hAnsi="Aptos"/>
+          <w:sz w:val="22"/>
+          <w:szCs w:val="22"/>
+        </w:rPr>
+        <w:t>En móvil, la navegación se convierte en un menú desplegable, pero conserva los mismos destinos y el mismo orden.</w:t>
+      </w:r>
+      <w:r>
+        <w:rPr>
+          <w:rFonts w:ascii="Aptos" w:hAnsi="Aptos"/>
+          <w:sz w:val="22"/>
+          <w:szCs w:val="22"/>
+        </w:rPr>
+        <w:t xml:space="preserve"> </w:t>
+      </w:r>
+      <w:r>
+        <w:rPr>
+          <w:rFonts w:ascii="Aptos" w:hAnsi="Aptos"/>
+          <w:sz w:val="22"/>
+          <w:szCs w:val="22"/>
+        </w:rPr>
+        <w:t>Las interacciones no deben impedir la lectura, la navegación con teclado ni el acceso a los enlaces.</w:t>
+      </w:r>
+    </w:p>
+    <w:p>
+      <w:pPr>
+        <w:rPr>
+          <w:rFonts w:ascii="Aptos" w:hAnsi="Aptos"/>
           <w:sz w:val="22"/>
           <w:szCs w:val="22"/>
           <w:lang w:val="es-ES_tradnl"/>
         </w:rPr>
-        <w:t>híbrida</w:t>
-      </w:r>
-      <w:r>
-        <w:rPr>
+      </w:pPr>
+      <w:r>
+        <w:rPr>
+          <w:rFonts w:ascii="Aptos" w:hAnsi="Aptos"/>
           <w:sz w:val="22"/>
           <w:szCs w:val="22"/>
           <w:lang w:val="es-ES_tradnl"/>
         </w:rPr>
-        <w:t xml:space="preserve"> es un </w:t>
-      </w:r>
-      <w:r>
-        <w:rPr>
-          <w:sz w:val="22"/>
-          <w:szCs w:val="22"/>
-        </w:rPr>
-        <w:t>two-page website</w:t>
-      </w:r>
-      <w:r>
-        <w:rPr>
-          <w:sz w:val="22"/>
-          <w:szCs w:val="22"/>
-        </w:rPr>
-        <w:t xml:space="preserve">. </w:t>
-      </w:r>
-      <w:r>
-        <w:rPr>
+        <w:t xml:space="preserve">El orden va: primero un </w:t>
+      </w:r>
+      <w:r>
+        <w:rPr>
+          <w:rFonts w:ascii="Aptos" w:hAnsi="Aptos"/>
           <w:sz w:val="22"/>
           <w:szCs w:val="22"/>
           <w:lang w:val="es-ES_tradnl"/>
         </w:rPr>
-        <w:t xml:space="preserve">Hay un pre </w:t>
+        <w:t>I</w:t>
+      </w:r>
+      <w:r>
+        <w:rPr>
+          <w:rFonts w:ascii="Aptos" w:hAnsi="Aptos"/>
+          <w:sz w:val="22"/>
+          <w:szCs w:val="22"/>
+          <w:lang w:val="es-ES_tradnl"/>
+        </w:rPr>
+        <w:t>nicio</w:t>
+      </w:r>
+      <w:r>
+        <w:rPr>
+          <w:rFonts w:ascii="Aptos" w:hAnsi="Aptos"/>
+          <w:sz w:val="22"/>
+          <w:szCs w:val="22"/>
+          <w:lang w:val="es-ES_tradnl"/>
+        </w:rPr>
+        <w:t xml:space="preserve">, </w:t>
+      </w:r>
+      <w:r>
+        <w:rPr>
+          <w:rFonts w:ascii="Aptos" w:hAnsi="Aptos"/>
+          <w:sz w:val="22"/>
+          <w:szCs w:val="22"/>
+          <w:lang w:val="es-ES_tradnl"/>
+        </w:rPr>
+        <w:t xml:space="preserve">luego sobre mí, </w:t>
+      </w:r>
+      <w:r>
+        <w:rPr>
+          <w:rFonts w:ascii="Aptos" w:hAnsi="Aptos"/>
+          <w:sz w:val="22"/>
+          <w:szCs w:val="22"/>
+          <w:lang w:val="es-ES_tradnl"/>
+        </w:rPr>
+        <w:t>después la sección más larga la de mis proyec</w:t>
+      </w:r>
+      <w:r>
+        <w:rPr>
+          <w:rFonts w:ascii="Aptos" w:hAnsi="Aptos"/>
+          <w:sz w:val="22"/>
+          <w:szCs w:val="22"/>
+          <w:lang w:val="es-ES_tradnl"/>
+        </w:rPr>
+        <w:t>tos y, por último, cómo contactarme. Todo debe ser responsivo y aplicar mi sistema de diseño.</w:t>
+      </w:r>
+    </w:p>
+    <w:p>
+      <w:pPr>
+        <w:rPr>
+          <w:rFonts w:ascii="Aptos" w:hAnsi="Aptos"/>
+          <w:b/>
+          <w:bCs/>
+          <w:sz w:val="22"/>
+          <w:szCs w:val="22"/>
+          <w:lang w:val="es-ES_tradnl"/>
+        </w:rPr>
+      </w:pPr>
+      <w:r>
+        <w:rPr>
+          <w:rFonts w:ascii="Aptos" w:hAnsi="Aptos"/>
+          <w:b/>
+          <w:bCs/>
+          <w:sz w:val="22"/>
+          <w:szCs w:val="22"/>
+          <w:lang w:val="es-ES_tradnl"/>
+        </w:rPr>
+        <w:t xml:space="preserve">2. </w:t>
+      </w:r>
+      <w:r>
+        <w:rPr>
+          <w:rFonts w:ascii="Aptos" w:hAnsi="Aptos"/>
+          <w:b/>
+          <w:bCs/>
+          <w:sz w:val="22"/>
+          <w:szCs w:val="22"/>
+          <w:lang w:val="es-ES_tradnl"/>
+        </w:rPr>
+        <w:t>Inicio (</w:t>
       </w:r>
       <w:proofErr w:type="spellStart"/>
       <w:r>
         <w:rPr>
+          <w:rFonts w:ascii="Aptos" w:hAnsi="Aptos"/>
+          <w:b/>
+          <w:bCs/>
           <w:sz w:val="22"/>
           <w:szCs w:val="22"/>
           <w:lang w:val="es-ES_tradnl"/>
         </w:rPr>
-        <w:t>loading</w:t>
+        <w:t>hero</w:t>
       </w:r>
       <w:proofErr w:type="spellEnd"/>
       <w:r>
         <w:rPr>
+          <w:rFonts w:ascii="Aptos" w:hAnsi="Aptos"/>
+          <w:b/>
+          <w:bCs/>
           <w:sz w:val="22"/>
           <w:szCs w:val="22"/>
           <w:lang w:val="es-ES_tradnl"/>
         </w:rPr>
+        <w:t>)</w:t>
+      </w:r>
+    </w:p>
+    <w:p>
+      <w:pPr>
+        <w:rPr>
+          <w:rFonts w:ascii="Aptos" w:eastAsia="Calibri" w:hAnsi="Aptos"/>
+          <w:color w:val="202225"/>
+          <w:sz w:val="22"/>
+          <w:szCs w:val="22"/>
+        </w:rPr>
+      </w:pPr>
+      <w:r>
+        <w:rPr>
+          <w:rFonts w:ascii="Aptos" w:eastAsia="Calibri" w:hAnsi="Aptos"/>
+          <w:color w:val="202225"/>
+          <w:sz w:val="22"/>
+          <w:szCs w:val="22"/>
+        </w:rPr>
+        <w:t>El hero ocupa la primera pantalla</w:t>
+      </w:r>
+      <w:r>
+        <w:rPr>
+          <w:rFonts w:ascii="Aptos" w:eastAsia="Calibri" w:hAnsi="Aptos"/>
+          <w:color w:val="202225"/>
+          <w:sz w:val="22"/>
+          <w:szCs w:val="22"/>
+        </w:rPr>
+        <w:t>, se ve completa en escritorio y completa en móvil</w:t>
+      </w:r>
+      <w:r>
+        <w:rPr>
+          <w:rFonts w:ascii="Aptos" w:eastAsia="Calibri" w:hAnsi="Aptos"/>
+          <w:color w:val="202225"/>
+          <w:sz w:val="22"/>
+          <w:szCs w:val="22"/>
+        </w:rPr>
+        <w:t xml:space="preserve"> y utiliza una sola columna. El contenido se presenta centrado en este orden: </w:t>
+      </w:r>
+      <w:r>
+        <w:rPr>
+          <w:rFonts w:ascii="Aptos" w:eastAsia="Calibri" w:hAnsi="Aptos"/>
+          <w:color w:val="202225"/>
+          <w:sz w:val="22"/>
+          <w:szCs w:val="22"/>
+        </w:rPr>
+        <w:t>logo</w:t>
+      </w:r>
+      <w:r>
+        <w:rPr>
+          <w:rFonts w:ascii="Aptos" w:eastAsia="Calibri" w:hAnsi="Aptos"/>
+          <w:color w:val="202225"/>
+          <w:sz w:val="22"/>
+          <w:szCs w:val="22"/>
+        </w:rPr>
+        <w:t xml:space="preserve"> completo en gran formato, frase de presentación, botones de navegación y accesos a redes sociales. No aparece una fotografía personal en esta sección.</w:t>
+      </w:r>
+    </w:p>
+    <w:p>
+      <w:pPr>
+        <w:rPr>
+          <w:rFonts w:ascii="Aptos" w:hAnsi="Aptos"/>
+          <w:sz w:val="22"/>
+          <w:szCs w:val="22"/>
+        </w:rPr>
+      </w:pPr>
+      <w:r>
+        <w:rPr>
+          <w:rFonts w:ascii="Aptos" w:eastAsia="Calibri" w:hAnsi="Aptos"/>
+          <w:b/>
+          <w:color w:val="202225"/>
+          <w:sz w:val="22"/>
+          <w:szCs w:val="22"/>
+        </w:rPr>
+        <w:t>Texto principal:</w:t>
+      </w:r>
+      <w:r>
+        <w:rPr>
+          <w:rFonts w:ascii="Aptos" w:eastAsia="Calibri" w:hAnsi="Aptos"/>
+          <w:color w:val="202225"/>
+          <w:sz w:val="22"/>
+          <w:szCs w:val="22"/>
+        </w:rPr>
+        <w:t xml:space="preserve"> “Transformo ideas en experiencias visuales claras, vibrantes y con personalidad”.</w:t>
+      </w:r>
+    </w:p>
+    <w:p>
+      <w:pPr>
+        <w:pStyle w:val="Listaconvietas"/>
+        <w:rPr>
+          <w:rFonts w:ascii="Aptos" w:hAnsi="Aptos"/>
+          <w:lang w:val="es-MX"/>
+        </w:rPr>
+      </w:pPr>
+      <w:r>
+        <w:rPr>
+          <w:rFonts w:ascii="Aptos" w:eastAsia="Calibri" w:hAnsi="Aptos"/>
+          <w:b/>
+          <w:lang w:val="es-MX"/>
+        </w:rPr>
+        <w:t>Botón “Conóceme”:</w:t>
+      </w:r>
+      <w:r>
+        <w:rPr>
+          <w:rFonts w:ascii="Aptos" w:eastAsia="Calibri" w:hAnsi="Aptos"/>
+          <w:lang w:val="es-MX"/>
+        </w:rPr>
+        <w:t xml:space="preserve"> lleva a </w:t>
+      </w:r>
+      <w:r>
+        <w:rPr>
+          <w:rFonts w:ascii="Aptos" w:eastAsia="Calibri" w:hAnsi="Aptos"/>
+          <w:lang w:val="es-MX"/>
+        </w:rPr>
+        <w:t>S</w:t>
+      </w:r>
+      <w:r>
+        <w:rPr>
+          <w:rFonts w:ascii="Aptos" w:eastAsia="Calibri" w:hAnsi="Aptos"/>
+          <w:lang w:val="es-MX"/>
+        </w:rPr>
+        <w:t>obre</w:t>
+      </w:r>
+      <w:r>
+        <w:rPr>
+          <w:rFonts w:ascii="Aptos" w:eastAsia="Calibri" w:hAnsi="Aptos"/>
+          <w:lang w:val="es-MX"/>
+        </w:rPr>
         <w:t xml:space="preserve"> </w:t>
       </w:r>
       <w:r>
         <w:rPr>
+          <w:rFonts w:ascii="Aptos" w:eastAsia="Calibri" w:hAnsi="Aptos"/>
+          <w:lang w:val="es-MX"/>
+        </w:rPr>
+        <w:t>m</w:t>
+      </w:r>
+      <w:r>
+        <w:rPr>
+          <w:rFonts w:ascii="Aptos" w:eastAsia="Calibri" w:hAnsi="Aptos"/>
+          <w:lang w:val="es-MX"/>
+        </w:rPr>
+        <w:t>í</w:t>
+      </w:r>
+      <w:r>
+        <w:rPr>
+          <w:rFonts w:ascii="Aptos" w:eastAsia="Calibri" w:hAnsi="Aptos"/>
+          <w:lang w:val="es-MX"/>
+        </w:rPr>
+        <w:t>.</w:t>
+      </w:r>
+    </w:p>
+    <w:p>
+      <w:pPr>
+        <w:pStyle w:val="Listaconvietas"/>
+        <w:rPr>
+          <w:rFonts w:ascii="Aptos" w:hAnsi="Aptos"/>
+          <w:lang w:val="es-MX"/>
+        </w:rPr>
+      </w:pPr>
+      <w:r>
+        <w:rPr>
+          <w:rFonts w:ascii="Aptos" w:eastAsia="Calibri" w:hAnsi="Aptos"/>
+          <w:b/>
+          <w:lang w:val="es-MX"/>
+        </w:rPr>
+        <w:lastRenderedPageBreak/>
+        <w:t>Botón “Ver proyectos”:</w:t>
+      </w:r>
+      <w:r>
+        <w:rPr>
+          <w:rFonts w:ascii="Aptos" w:eastAsia="Calibri" w:hAnsi="Aptos"/>
+          <w:lang w:val="es-MX"/>
+        </w:rPr>
+        <w:t xml:space="preserve"> lleva a </w:t>
+      </w:r>
+      <w:r>
+        <w:rPr>
+          <w:rFonts w:ascii="Aptos" w:eastAsia="Calibri" w:hAnsi="Aptos"/>
+          <w:lang w:val="es-MX"/>
+        </w:rPr>
+        <w:t>Proyectos</w:t>
+      </w:r>
+      <w:r>
+        <w:rPr>
+          <w:rFonts w:ascii="Aptos" w:eastAsia="Calibri" w:hAnsi="Aptos"/>
+          <w:lang w:val="es-MX"/>
+        </w:rPr>
+        <w:t>.</w:t>
+      </w:r>
+    </w:p>
+    <w:p>
+      <w:pPr>
+        <w:pStyle w:val="Listaconvietas"/>
+        <w:rPr>
+          <w:rFonts w:ascii="Aptos" w:hAnsi="Aptos"/>
+          <w:lang w:val="es-MX"/>
+        </w:rPr>
+      </w:pPr>
+      <w:r>
+        <w:rPr>
+          <w:rFonts w:ascii="Aptos" w:eastAsia="Calibri" w:hAnsi="Aptos"/>
+          <w:b/>
+          <w:lang w:val="es-MX"/>
+        </w:rPr>
+        <w:t>Íconos de redes:</w:t>
+      </w:r>
+      <w:r>
+        <w:rPr>
+          <w:rFonts w:ascii="Aptos" w:eastAsia="Calibri" w:hAnsi="Aptos"/>
+          <w:lang w:val="es-MX"/>
+        </w:rPr>
+        <w:t xml:space="preserve"> utilizan los mismos enlaces definidos en Contacto.</w:t>
+      </w:r>
+    </w:p>
+    <w:p>
+      <w:pPr>
+        <w:rPr>
+          <w:rFonts w:ascii="Aptos" w:hAnsi="Aptos"/>
+          <w:sz w:val="22"/>
+          <w:szCs w:val="22"/>
+        </w:rPr>
+      </w:pPr>
+    </w:p>
+    <w:p>
+      <w:pPr>
+        <w:rPr>
+          <w:rFonts w:ascii="Aptos" w:hAnsi="Aptos"/>
+          <w:b/>
+          <w:bCs/>
           <w:sz w:val="22"/>
           <w:szCs w:val="22"/>
           <w:lang w:val="es-ES_tradnl"/>
         </w:rPr>
-        <w:t xml:space="preserve">entre cada una </w:t>
-      </w:r>
-      <w:r>
-        <w:rPr>
+      </w:pPr>
+      <w:r>
+        <w:rPr>
+          <w:rFonts w:ascii="Aptos" w:hAnsi="Aptos"/>
+          <w:b/>
+          <w:bCs/>
           <w:sz w:val="22"/>
           <w:szCs w:val="22"/>
           <w:lang w:val="es-ES_tradnl"/>
         </w:rPr>
-        <w:t xml:space="preserve">con el </w:t>
-      </w:r>
-      <w:r>
-        <w:rPr>
+        <w:t>3. Sobre mí</w:t>
+      </w:r>
+    </w:p>
+    <w:p>
+      <w:pPr>
+        <w:rPr>
+          <w:rFonts w:ascii="Aptos" w:hAnsi="Aptos"/>
+          <w:sz w:val="22"/>
+          <w:szCs w:val="22"/>
+        </w:rPr>
+      </w:pPr>
+      <w:r>
+        <w:rPr>
+          <w:rFonts w:ascii="Aptos" w:hAnsi="Aptos"/>
+          <w:sz w:val="22"/>
+          <w:szCs w:val="22"/>
+        </w:rPr>
+        <w:t>La sección se organiza en dos bloques de contenido: a la izquierda aparece mi fotografía convertida en GIF y a la derecha mi presentación. En móvil, el GIF aparece primero y el texto después.</w:t>
+      </w:r>
+    </w:p>
+    <w:p>
+      <w:pPr>
+        <w:rPr>
+          <w:rFonts w:ascii="Aptos" w:hAnsi="Aptos"/>
+          <w:sz w:val="22"/>
+          <w:szCs w:val="22"/>
+        </w:rPr>
+      </w:pPr>
+      <w:r>
+        <w:rPr>
+          <w:rFonts w:ascii="Aptos" w:hAnsi="Aptos"/>
+          <w:sz w:val="22"/>
+          <w:szCs w:val="22"/>
+        </w:rPr>
+        <w:t>Texto de presentación: “Soy Valeria</w:t>
+      </w:r>
+      <w:r>
+        <w:rPr>
+          <w:rFonts w:ascii="Aptos" w:hAnsi="Aptos"/>
+          <w:sz w:val="22"/>
+          <w:szCs w:val="22"/>
+        </w:rPr>
+        <w:t>/</w:t>
+      </w:r>
+      <w:r>
+        <w:rPr>
+          <w:rFonts w:ascii="Aptos" w:hAnsi="Aptos"/>
+          <w:sz w:val="22"/>
+          <w:szCs w:val="22"/>
+        </w:rPr>
+        <w:t>Victoria, diseñadora gráfica digital y estudiante de la Universidad La Salle. Me interesa desarrollar proyectos de identidad visual, diseño editorial, UX/UI, ilustración, campañas y 3D. Disfruto aprender nuevas herramientas, explorar campos distintos y combinar creatividad, organización y estrategia”.</w:t>
+      </w:r>
+    </w:p>
+    <w:p>
+      <w:pPr>
+        <w:rPr>
+          <w:rFonts w:ascii="Aptos" w:hAnsi="Aptos"/>
+          <w:sz w:val="22"/>
+          <w:szCs w:val="22"/>
+        </w:rPr>
+      </w:pPr>
+      <w:r>
+        <w:rPr>
+          <w:rFonts w:ascii="Aptos" w:hAnsi="Aptos"/>
+          <w:sz w:val="22"/>
+          <w:szCs w:val="22"/>
+        </w:rPr>
+        <w:t>Texto complementario: “Soy una persona curiosa y disfruto comprender el propósito detrás de cada proyecto. Para mí, el diseño consiste en configurar nuevas experiencias y medios; al experimentar con ideas, formas y movimiento es posible crear algo claro, útil y memorable”.</w:t>
+      </w:r>
+    </w:p>
+    <w:p>
+      <w:pPr>
+        <w:rPr>
+          <w:rFonts w:ascii="Aptos" w:hAnsi="Aptos"/>
+          <w:sz w:val="22"/>
+          <w:szCs w:val="22"/>
+        </w:rPr>
+      </w:pPr>
+      <w:r>
+        <w:rPr>
+          <w:rFonts w:ascii="Aptos" w:hAnsi="Aptos"/>
+          <w:sz w:val="22"/>
+          <w:szCs w:val="22"/>
+        </w:rPr>
+        <w:t>Hay una sub-sección sobre mi Educación</w:t>
+      </w:r>
+      <w:r>
+        <w:rPr>
+          <w:rFonts w:ascii="Aptos" w:hAnsi="Aptos"/>
+          <w:sz w:val="22"/>
+          <w:szCs w:val="22"/>
+        </w:rPr>
+        <w:t>, aparece un grupo de tarjetas con estos contenidos:</w:t>
+      </w:r>
+    </w:p>
+    <w:p>
+      <w:pPr>
+        <w:pStyle w:val="Ttulo3"/>
+        <w:rPr>
+          <w:rFonts w:ascii="Aptos" w:hAnsi="Aptos"/>
+          <w:b/>
+          <w:bCs/>
+          <w:sz w:val="22"/>
+          <w:szCs w:val="22"/>
+        </w:rPr>
+      </w:pPr>
+      <w:r>
+        <w:rPr>
+          <w:rFonts w:ascii="Aptos" w:eastAsia="Calibri" w:hAnsi="Aptos"/>
+          <w:b/>
+          <w:bCs/>
+          <w:color w:val="202225"/>
+          <w:sz w:val="22"/>
+          <w:szCs w:val="22"/>
+        </w:rPr>
+        <w:t>Licenciatura en Diseño Gráfico Digital</w:t>
+      </w:r>
+    </w:p>
+    <w:p>
+      <w:pPr>
+        <w:rPr>
+          <w:rFonts w:ascii="Aptos" w:hAnsi="Aptos"/>
+          <w:sz w:val="22"/>
+          <w:szCs w:val="22"/>
+        </w:rPr>
+      </w:pPr>
+      <w:r>
+        <w:rPr>
+          <w:rFonts w:ascii="Aptos" w:eastAsia="Calibri" w:hAnsi="Aptos"/>
+          <w:color w:val="202225"/>
+          <w:sz w:val="22"/>
+          <w:szCs w:val="22"/>
+        </w:rPr>
+        <w:t>Universidad La Salle · 2023–2027</w:t>
+      </w:r>
+    </w:p>
+    <w:p>
+      <w:pPr>
+        <w:pStyle w:val="Ttulo3"/>
+        <w:rPr>
+          <w:rFonts w:ascii="Aptos" w:hAnsi="Aptos"/>
+          <w:b/>
+          <w:bCs/>
+          <w:sz w:val="22"/>
+          <w:szCs w:val="22"/>
+        </w:rPr>
+      </w:pPr>
+      <w:r>
+        <w:rPr>
+          <w:rFonts w:ascii="Aptos" w:eastAsia="Calibri" w:hAnsi="Aptos"/>
+          <w:b/>
+          <w:bCs/>
+          <w:color w:val="202225"/>
+          <w:sz w:val="22"/>
+          <w:szCs w:val="22"/>
+        </w:rPr>
+        <w:t>Intercambio académico</w:t>
+      </w:r>
+    </w:p>
+    <w:p>
+      <w:pPr>
+        <w:rPr>
+          <w:rFonts w:ascii="Aptos" w:hAnsi="Aptos"/>
+          <w:sz w:val="22"/>
+          <w:szCs w:val="22"/>
+        </w:rPr>
+      </w:pPr>
+      <w:r>
+        <w:rPr>
+          <w:rFonts w:ascii="Aptos" w:eastAsia="Calibri" w:hAnsi="Aptos"/>
+          <w:color w:val="202225"/>
+          <w:sz w:val="22"/>
+          <w:szCs w:val="22"/>
+        </w:rPr>
+        <w:t>Ulster University, Irlanda del Norte · 2026</w:t>
+      </w:r>
+    </w:p>
+    <w:p>
+      <w:pPr>
+        <w:pStyle w:val="Ttulo3"/>
+        <w:rPr>
+          <w:rFonts w:ascii="Aptos" w:hAnsi="Aptos"/>
+          <w:b/>
+          <w:bCs/>
+          <w:sz w:val="22"/>
+          <w:szCs w:val="22"/>
+        </w:rPr>
+      </w:pPr>
+      <w:r>
+        <w:rPr>
+          <w:rFonts w:ascii="Aptos" w:eastAsia="Calibri" w:hAnsi="Aptos"/>
+          <w:b/>
+          <w:bCs/>
+          <w:color w:val="202225"/>
+          <w:sz w:val="22"/>
+          <w:szCs w:val="22"/>
+        </w:rPr>
+        <w:t>Finalista en a! Diseño</w:t>
+      </w:r>
+    </w:p>
+    <w:p>
+      <w:pPr>
+        <w:rPr>
+          <w:rFonts w:ascii="Aptos" w:hAnsi="Aptos"/>
+          <w:sz w:val="22"/>
+          <w:szCs w:val="22"/>
+        </w:rPr>
+      </w:pPr>
+      <w:r>
+        <w:rPr>
+          <w:rFonts w:ascii="Aptos" w:eastAsia="Calibri" w:hAnsi="Aptos"/>
+          <w:color w:val="202225"/>
+          <w:sz w:val="22"/>
+          <w:szCs w:val="22"/>
+        </w:rPr>
+        <w:t>Categorías de Identidad de Marca y Tipografía · 2026</w:t>
+      </w:r>
+    </w:p>
+    <w:p>
+      <w:pPr>
+        <w:rPr>
+          <w:rFonts w:ascii="Aptos" w:hAnsi="Aptos"/>
+          <w:sz w:val="22"/>
+          <w:szCs w:val="22"/>
+        </w:rPr>
+      </w:pPr>
+      <w:r>
+        <w:rPr>
+          <w:rFonts w:ascii="Aptos" w:eastAsia="Calibri" w:hAnsi="Aptos"/>
+          <w:bCs/>
+          <w:color w:val="202225"/>
+          <w:sz w:val="22"/>
+          <w:szCs w:val="22"/>
+        </w:rPr>
+        <w:t>En</w:t>
+      </w:r>
+      <w:r>
+        <w:rPr>
+          <w:rFonts w:ascii="Aptos" w:eastAsia="Calibri" w:hAnsi="Aptos"/>
+          <w:color w:val="202225"/>
+          <w:sz w:val="22"/>
+          <w:szCs w:val="22"/>
+        </w:rPr>
+        <w:t xml:space="preserve"> escritorio, las tarjetas pueden arrastrarse horizontalmente y continúan en un loop. En móvil, funcionan como un carrusel horizontal que puede recorrerse con el dedo. También deben incluir controles alternativos para que el contenido no dependa únicamente del arrastre.</w:t>
+      </w:r>
+    </w:p>
+    <w:p>
+      <w:pPr>
+        <w:rPr>
+          <w:rFonts w:ascii="Aptos" w:hAnsi="Aptos"/>
+          <w:sz w:val="22"/>
+          <w:szCs w:val="22"/>
+        </w:rPr>
+      </w:pPr>
+      <w:r>
+        <w:rPr>
+          <w:rFonts w:ascii="Aptos" w:hAnsi="Aptos"/>
+          <w:sz w:val="22"/>
+          <w:szCs w:val="22"/>
+        </w:rPr>
+        <w:t xml:space="preserve">La segunda sub-sección es Habilidades, </w:t>
+      </w:r>
+      <w:r>
+        <w:rPr>
+          <w:rFonts w:ascii="Aptos" w:hAnsi="Aptos"/>
+          <w:sz w:val="22"/>
+          <w:szCs w:val="22"/>
+        </w:rPr>
+        <w:t>se presentan en un segundo grupo de tarjetas. Cada tarjeta contiene el nombre del área, una imagen representativa y una descripción breve del tipo de trabajo que realizo.</w:t>
+      </w:r>
+    </w:p>
+    <w:p>
+      <w:pPr>
+        <w:spacing w:after="70" w:line="240" w:lineRule="auto"/>
+        <w:rPr>
+          <w:rFonts w:ascii="Aptos" w:eastAsia="Calibri" w:hAnsi="Aptos" w:cs="Calibri"/>
+          <w:b/>
+          <w:bCs/>
+          <w:color w:val="202225"/>
+          <w:sz w:val="22"/>
+          <w:szCs w:val="22"/>
+        </w:rPr>
+      </w:pPr>
+      <w:r>
+        <w:rPr>
+          <w:rFonts w:ascii="Aptos" w:eastAsia="Calibri" w:hAnsi="Aptos" w:cs="Calibri"/>
+          <w:b/>
+          <w:bCs/>
+          <w:color w:val="202225"/>
+          <w:sz w:val="22"/>
+          <w:szCs w:val="22"/>
+        </w:rPr>
+        <w:t>Diseño de Identidad</w:t>
+      </w:r>
+    </w:p>
+    <w:p>
+      <w:pPr>
+        <w:spacing w:after="70" w:line="240" w:lineRule="auto"/>
+        <w:rPr>
+          <w:rFonts w:ascii="Aptos" w:hAnsi="Aptos"/>
+          <w:sz w:val="22"/>
+          <w:szCs w:val="22"/>
+        </w:rPr>
+      </w:pPr>
+      <w:r>
+        <w:rPr>
+          <w:rFonts w:ascii="Aptos" w:hAnsi="Aptos"/>
+          <w:sz w:val="22"/>
+          <w:szCs w:val="22"/>
+        </w:rPr>
+        <w:t>Construcción de conceptos, logotipos y sistemas visuales coherentes</w:t>
+      </w:r>
+    </w:p>
+    <w:p>
+      <w:pPr>
+        <w:spacing w:after="70" w:line="240" w:lineRule="auto"/>
+        <w:rPr>
+          <w:rFonts w:ascii="Aptos" w:eastAsia="Calibri" w:hAnsi="Aptos" w:cs="Calibri"/>
+          <w:b/>
+          <w:bCs/>
+          <w:color w:val="202225"/>
+          <w:sz w:val="22"/>
+          <w:szCs w:val="22"/>
+        </w:rPr>
+      </w:pPr>
+      <w:r>
+        <w:rPr>
+          <w:rFonts w:ascii="Aptos" w:eastAsia="Calibri" w:hAnsi="Aptos" w:cs="Calibri"/>
+          <w:b/>
+          <w:bCs/>
+          <w:color w:val="202225"/>
+          <w:sz w:val="22"/>
+          <w:szCs w:val="22"/>
+        </w:rPr>
+        <w:t>Ilustración</w:t>
+      </w:r>
+    </w:p>
+    <w:p>
+      <w:pPr>
+        <w:spacing w:after="70" w:line="240" w:lineRule="auto"/>
+        <w:rPr>
+          <w:rFonts w:ascii="Aptos" w:hAnsi="Aptos"/>
+          <w:sz w:val="22"/>
+          <w:szCs w:val="22"/>
+        </w:rPr>
+      </w:pPr>
+      <w:r>
+        <w:rPr>
+          <w:rFonts w:ascii="Aptos" w:hAnsi="Aptos"/>
+          <w:sz w:val="22"/>
+          <w:szCs w:val="22"/>
+        </w:rPr>
+        <w:t>Creación de recursos gráficos que complementan una idea o narrativa</w:t>
+      </w:r>
+    </w:p>
+    <w:p>
+      <w:pPr>
+        <w:spacing w:after="70" w:line="240" w:lineRule="auto"/>
+        <w:rPr>
+          <w:rFonts w:ascii="Aptos" w:eastAsia="Calibri" w:hAnsi="Aptos" w:cs="Calibri"/>
+          <w:b/>
+          <w:bCs/>
+          <w:color w:val="202225"/>
+          <w:sz w:val="22"/>
+          <w:szCs w:val="22"/>
+        </w:rPr>
+      </w:pPr>
+      <w:r>
+        <w:rPr>
+          <w:rFonts w:ascii="Aptos" w:eastAsia="Calibri" w:hAnsi="Aptos" w:cs="Calibri"/>
+          <w:b/>
+          <w:bCs/>
+          <w:color w:val="202225"/>
+          <w:sz w:val="22"/>
+          <w:szCs w:val="22"/>
+        </w:rPr>
+        <w:t>Campañas</w:t>
+      </w:r>
+    </w:p>
+    <w:p>
+      <w:pPr>
+        <w:spacing w:after="70" w:line="240" w:lineRule="auto"/>
+        <w:rPr>
+          <w:rFonts w:ascii="Aptos" w:hAnsi="Aptos"/>
+          <w:sz w:val="22"/>
+          <w:szCs w:val="22"/>
+        </w:rPr>
+      </w:pPr>
+      <w:r>
+        <w:rPr>
+          <w:rFonts w:ascii="Aptos" w:hAnsi="Aptos"/>
+          <w:sz w:val="22"/>
+          <w:szCs w:val="22"/>
+        </w:rPr>
+        <w:lastRenderedPageBreak/>
+        <w:t>Desarrollo de conceptos y adaptaciones para distintos medios y formatos</w:t>
+      </w:r>
+    </w:p>
+    <w:p>
+      <w:pPr>
+        <w:spacing w:after="70" w:line="240" w:lineRule="auto"/>
+        <w:rPr>
+          <w:rFonts w:ascii="Aptos" w:eastAsia="Calibri" w:hAnsi="Aptos" w:cs="Calibri"/>
+          <w:b/>
+          <w:bCs/>
+          <w:color w:val="202225"/>
+          <w:sz w:val="22"/>
+          <w:szCs w:val="22"/>
+        </w:rPr>
+      </w:pPr>
+      <w:r>
+        <w:rPr>
+          <w:rFonts w:ascii="Aptos" w:eastAsia="Calibri" w:hAnsi="Aptos" w:cs="Calibri"/>
+          <w:b/>
+          <w:bCs/>
+          <w:color w:val="202225"/>
+          <w:sz w:val="22"/>
+          <w:szCs w:val="22"/>
+        </w:rPr>
+        <w:t>Diseño UX/UI</w:t>
+      </w:r>
+    </w:p>
+    <w:p>
+      <w:pPr>
+        <w:spacing w:after="70" w:line="240" w:lineRule="auto"/>
+        <w:rPr>
+          <w:rFonts w:ascii="Aptos" w:hAnsi="Aptos"/>
+          <w:sz w:val="22"/>
+          <w:szCs w:val="22"/>
+        </w:rPr>
+      </w:pPr>
+      <w:r>
+        <w:rPr>
+          <w:rFonts w:ascii="Aptos" w:hAnsi="Aptos"/>
+          <w:sz w:val="22"/>
+          <w:szCs w:val="22"/>
+        </w:rPr>
+        <w:t>Organización de información, flujos, interfaces y prototipos</w:t>
+      </w:r>
+      <w:r>
+        <w:rPr>
+          <w:rFonts w:ascii="Aptos" w:hAnsi="Aptos"/>
+          <w:sz w:val="22"/>
+          <w:szCs w:val="22"/>
+        </w:rPr>
+        <w:t>.</w:t>
+      </w:r>
+    </w:p>
+    <w:p>
+      <w:pPr>
+        <w:spacing w:after="70" w:line="240" w:lineRule="auto"/>
+        <w:rPr>
+          <w:rFonts w:ascii="Aptos" w:eastAsia="Calibri" w:hAnsi="Aptos" w:cs="Calibri"/>
+          <w:b/>
+          <w:bCs/>
+          <w:color w:val="202225"/>
+          <w:sz w:val="22"/>
+          <w:szCs w:val="22"/>
+        </w:rPr>
+      </w:pPr>
+      <w:r>
+        <w:rPr>
+          <w:rFonts w:ascii="Aptos" w:eastAsia="Calibri" w:hAnsi="Aptos" w:cs="Calibri"/>
+          <w:b/>
+          <w:bCs/>
+          <w:color w:val="202225"/>
+          <w:sz w:val="22"/>
+          <w:szCs w:val="22"/>
+        </w:rPr>
+        <w:t>Diseño editorial</w:t>
+      </w:r>
+    </w:p>
+    <w:p>
+      <w:pPr>
+        <w:spacing w:after="70" w:line="240" w:lineRule="auto"/>
+        <w:rPr>
+          <w:rFonts w:ascii="Aptos" w:hAnsi="Aptos"/>
+          <w:sz w:val="22"/>
+          <w:szCs w:val="22"/>
+        </w:rPr>
+      </w:pPr>
+      <w:r>
+        <w:rPr>
+          <w:rFonts w:ascii="Aptos" w:hAnsi="Aptos"/>
+          <w:sz w:val="22"/>
+          <w:szCs w:val="22"/>
+        </w:rPr>
+        <w:t>Uso de retículas, jerarquías y composición para ordenar contenidos</w:t>
+      </w:r>
+    </w:p>
+    <w:p>
+      <w:pPr>
+        <w:spacing w:after="70" w:line="240" w:lineRule="auto"/>
+        <w:rPr>
+          <w:rFonts w:ascii="Aptos" w:hAnsi="Aptos"/>
+          <w:b/>
+          <w:bCs/>
+          <w:sz w:val="22"/>
+          <w:szCs w:val="22"/>
+        </w:rPr>
+      </w:pPr>
+      <w:r>
+        <w:rPr>
+          <w:rFonts w:ascii="Aptos" w:eastAsia="Calibri" w:hAnsi="Aptos" w:cs="Calibri"/>
+          <w:b/>
+          <w:bCs/>
+          <w:color w:val="202225"/>
+          <w:sz w:val="22"/>
+          <w:szCs w:val="22"/>
+        </w:rPr>
+        <w:t>Modelado 3D</w:t>
+      </w:r>
+    </w:p>
+    <w:p>
+      <w:pPr>
+        <w:rPr>
+          <w:rFonts w:ascii="Aptos" w:hAnsi="Aptos"/>
+          <w:sz w:val="22"/>
+          <w:szCs w:val="22"/>
+        </w:rPr>
+      </w:pPr>
+      <w:r>
+        <w:rPr>
+          <w:rFonts w:ascii="Aptos" w:hAnsi="Aptos"/>
+          <w:sz w:val="22"/>
+          <w:szCs w:val="22"/>
+        </w:rPr>
+        <w:t>Creación, texturizado y presentación de objetos o escenas tridimensionales</w:t>
+      </w:r>
+    </w:p>
+    <w:p>
+      <w:pPr>
+        <w:rPr>
+          <w:rFonts w:ascii="Aptos" w:eastAsia="Calibri" w:hAnsi="Aptos"/>
+          <w:color w:val="202225"/>
+          <w:sz w:val="22"/>
+          <w:szCs w:val="22"/>
+        </w:rPr>
+      </w:pPr>
+      <w:r>
+        <w:rPr>
+          <w:rFonts w:ascii="Aptos" w:eastAsia="Calibri" w:hAnsi="Aptos"/>
+          <w:color w:val="202225"/>
+          <w:sz w:val="22"/>
+          <w:szCs w:val="22"/>
+        </w:rPr>
+        <w:t>E</w:t>
+      </w:r>
+      <w:r>
+        <w:rPr>
+          <w:rFonts w:ascii="Aptos" w:eastAsia="Calibri" w:hAnsi="Aptos"/>
+          <w:color w:val="202225"/>
+          <w:sz w:val="22"/>
+          <w:szCs w:val="22"/>
+        </w:rPr>
+        <w:t>n escritorio, las tarjetas pueden arrastrarse como una secuencia continua. En móvil, se recorren mediante desplazamiento horizontal. La tarjeta activa debe poder abrirse también con teclado o toque.</w:t>
+      </w:r>
+    </w:p>
+    <w:p>
+      <w:pPr>
+        <w:rPr>
+          <w:rFonts w:ascii="Aptos" w:eastAsia="Calibri" w:hAnsi="Aptos"/>
+          <w:color w:val="202225"/>
+          <w:sz w:val="22"/>
+          <w:szCs w:val="22"/>
+        </w:rPr>
+      </w:pPr>
+      <w:r>
+        <w:rPr>
+          <w:rFonts w:ascii="Aptos" w:eastAsia="Calibri" w:hAnsi="Aptos"/>
+          <w:color w:val="202225"/>
+          <w:sz w:val="22"/>
+          <w:szCs w:val="22"/>
+        </w:rPr>
+        <w:t xml:space="preserve">Al final de la sección sobre mí, cito una frase </w:t>
+      </w:r>
+      <w:r>
+        <w:rPr>
+          <w:rFonts w:ascii="Aptos" w:eastAsia="Calibri" w:hAnsi="Aptos"/>
+          <w:color w:val="202225"/>
+          <w:sz w:val="22"/>
+          <w:szCs w:val="22"/>
+        </w:rPr>
+        <w:t xml:space="preserve">para cerrar la sección completa, </w:t>
+      </w:r>
+      <w:r>
+        <w:rPr>
+          <w:rFonts w:ascii="Aptos" w:eastAsia="Calibri" w:hAnsi="Aptos"/>
+          <w:color w:val="202225"/>
+          <w:sz w:val="22"/>
+          <w:szCs w:val="22"/>
+        </w:rPr>
+        <w:t xml:space="preserve">que </w:t>
+      </w:r>
+      <w:r>
+        <w:rPr>
+          <w:rFonts w:ascii="Aptos" w:eastAsia="Calibri" w:hAnsi="Aptos"/>
+          <w:color w:val="202225"/>
+          <w:sz w:val="22"/>
+          <w:szCs w:val="22"/>
+        </w:rPr>
+        <w:t>me inspira: “S</w:t>
+      </w:r>
+      <w:r>
+        <w:rPr>
+          <w:rFonts w:ascii="Aptos" w:eastAsia="Calibri" w:hAnsi="Aptos"/>
+          <w:color w:val="202225"/>
+          <w:sz w:val="22"/>
+          <w:szCs w:val="22"/>
+        </w:rPr>
+        <w:t>i podemos sintonizar con la idea de crear cosas y compartirlas sin depender del resultado es más probable que la obra se nos revele en su verdadera expresión.</w:t>
+      </w:r>
+      <w:r>
+        <w:rPr>
+          <w:rFonts w:ascii="Aptos" w:eastAsia="Calibri" w:hAnsi="Aptos"/>
+          <w:color w:val="202225"/>
+          <w:sz w:val="22"/>
+          <w:szCs w:val="22"/>
+        </w:rPr>
+        <w:t xml:space="preserve">” </w:t>
+      </w:r>
+      <w:r>
+        <w:rPr>
+          <w:rFonts w:ascii="Aptos" w:eastAsia="Calibri" w:hAnsi="Aptos"/>
+          <w:color w:val="202225"/>
+          <w:sz w:val="22"/>
+          <w:szCs w:val="22"/>
+        </w:rPr>
+        <w:t>–</w:t>
+      </w:r>
+      <w:r>
+        <w:rPr>
+          <w:rFonts w:ascii="Aptos" w:eastAsia="Calibri" w:hAnsi="Aptos"/>
+          <w:color w:val="202225"/>
+          <w:sz w:val="22"/>
+          <w:szCs w:val="22"/>
+        </w:rPr>
+        <w:t xml:space="preserve"> </w:t>
+      </w:r>
+      <w:r>
+        <w:rPr>
+          <w:rFonts w:ascii="Aptos" w:eastAsia="Calibri" w:hAnsi="Aptos"/>
+          <w:color w:val="202225"/>
+          <w:sz w:val="22"/>
+          <w:szCs w:val="22"/>
+        </w:rPr>
+        <w:t>Rick Rubin</w:t>
+      </w:r>
+    </w:p>
+    <w:p>
+      <w:pPr>
+        <w:rPr>
+          <w:rFonts w:ascii="Aptos" w:hAnsi="Aptos"/>
+          <w:b/>
+          <w:bCs/>
           <w:sz w:val="22"/>
           <w:szCs w:val="22"/>
           <w:lang w:val="es-ES_tradnl"/>
         </w:rPr>
-        <w:t>ícono de mi marca</w:t>
-      </w:r>
-      <w:r>
-        <w:rPr>
+      </w:pPr>
+      <w:r>
+        <w:rPr>
+          <w:rFonts w:ascii="Aptos" w:hAnsi="Aptos"/>
+          <w:b/>
+          <w:bCs/>
           <w:sz w:val="22"/>
           <w:szCs w:val="22"/>
           <w:lang w:val="es-ES_tradnl"/>
         </w:rPr>
-        <w:t xml:space="preserve"> que</w:t>
-      </w:r>
-      <w:r>
-        <w:rPr>
+        <w:t xml:space="preserve">4. </w:t>
+      </w:r>
+      <w:r>
+        <w:rPr>
+          <w:rFonts w:ascii="Aptos" w:hAnsi="Aptos"/>
+          <w:b/>
+          <w:bCs/>
           <w:sz w:val="22"/>
           <w:szCs w:val="22"/>
           <w:lang w:val="es-ES_tradnl"/>
         </w:rPr>
-        <w:t xml:space="preserve"> se desliza suavemente hacia arriba y descubre </w:t>
-      </w:r>
-      <w:r>
-        <w:rPr>
+        <w:t xml:space="preserve">Mis </w:t>
+      </w:r>
+      <w:r>
+        <w:rPr>
+          <w:rFonts w:ascii="Aptos" w:hAnsi="Aptos"/>
+          <w:b/>
+          <w:bCs/>
           <w:sz w:val="22"/>
           <w:szCs w:val="22"/>
           <w:lang w:val="es-ES_tradnl"/>
         </w:rPr>
-        <w:t>página</w:t>
-      </w:r>
-      <w:r>
-        <w:rPr>
-          <w:sz w:val="22"/>
-          <w:szCs w:val="22"/>
-          <w:lang w:val="es-ES_tradnl"/>
-        </w:rPr>
-        <w:t xml:space="preserve">, </w:t>
-      </w:r>
-      <w:r>
-        <w:rPr>
-          <w:sz w:val="22"/>
-          <w:szCs w:val="22"/>
-          <w:lang w:val="es-ES_tradnl"/>
-        </w:rPr>
-        <w:t>arr</w:t>
-      </w:r>
-      <w:r>
-        <w:rPr>
-          <w:sz w:val="22"/>
-          <w:szCs w:val="22"/>
-          <w:lang w:val="es-ES_tradnl"/>
-        </w:rPr>
-        <w:t>i</w:t>
-      </w:r>
-      <w:r>
-        <w:rPr>
-          <w:sz w:val="22"/>
-          <w:szCs w:val="22"/>
-          <w:lang w:val="es-ES_tradnl"/>
-        </w:rPr>
-        <w:t>ba está el menú fijo con el ícono</w:t>
-      </w:r>
-      <w:r>
-        <w:rPr>
-          <w:sz w:val="22"/>
-          <w:szCs w:val="22"/>
-          <w:lang w:val="es-ES_tradnl"/>
-        </w:rPr>
-        <w:t xml:space="preserve"> de mi marca</w:t>
-      </w:r>
-      <w:r>
-        <w:rPr>
-          <w:sz w:val="22"/>
-          <w:szCs w:val="22"/>
-          <w:lang w:val="es-ES_tradnl"/>
-        </w:rPr>
-        <w:t xml:space="preserve"> que es </w:t>
-      </w:r>
-      <w:r>
-        <w:rPr>
-          <w:sz w:val="22"/>
-          <w:szCs w:val="22"/>
-          <w:lang w:val="es-ES_tradnl"/>
-        </w:rPr>
-        <w:t>botón que redirecciona al</w:t>
-      </w:r>
-      <w:r>
-        <w:rPr>
-          <w:sz w:val="22"/>
-          <w:szCs w:val="22"/>
-          <w:lang w:val="es-ES_tradnl"/>
-        </w:rPr>
-        <w:t xml:space="preserve"> Inicio</w:t>
-      </w:r>
-      <w:r>
-        <w:rPr>
-          <w:sz w:val="22"/>
-          <w:szCs w:val="22"/>
-          <w:lang w:val="es-ES_tradnl"/>
-        </w:rPr>
-        <w:t xml:space="preserve">, </w:t>
-      </w:r>
-      <w:r>
-        <w:rPr>
-          <w:sz w:val="22"/>
-          <w:szCs w:val="22"/>
-          <w:lang w:val="es-ES_tradnl"/>
-        </w:rPr>
-        <w:t>también están los enlaces de</w:t>
-      </w:r>
-      <w:r>
-        <w:rPr>
-          <w:sz w:val="22"/>
-          <w:szCs w:val="22"/>
-          <w:lang w:val="es-ES_tradnl"/>
-        </w:rPr>
-        <w:t xml:space="preserve"> </w:t>
-      </w:r>
-      <w:r>
-        <w:rPr>
-          <w:sz w:val="22"/>
-          <w:szCs w:val="22"/>
-          <w:lang w:val="es-ES_tradnl"/>
-        </w:rPr>
-        <w:t xml:space="preserve">Sobre mí, </w:t>
-      </w:r>
-      <w:r>
-        <w:rPr>
-          <w:sz w:val="22"/>
-          <w:szCs w:val="22"/>
-          <w:lang w:val="es-ES_tradnl"/>
-        </w:rPr>
-        <w:t xml:space="preserve">Mis </w:t>
-      </w:r>
-      <w:r>
-        <w:rPr>
-          <w:sz w:val="22"/>
-          <w:szCs w:val="22"/>
-          <w:lang w:val="es-ES_tradnl"/>
-        </w:rPr>
-        <w:t>P</w:t>
-      </w:r>
-      <w:r>
-        <w:rPr>
-          <w:sz w:val="22"/>
-          <w:szCs w:val="22"/>
-          <w:lang w:val="es-ES_tradnl"/>
-        </w:rPr>
-        <w:t>royectos</w:t>
-      </w:r>
-      <w:r>
-        <w:rPr>
-          <w:sz w:val="22"/>
-          <w:szCs w:val="22"/>
-          <w:lang w:val="es-ES_tradnl"/>
-        </w:rPr>
-        <w:t xml:space="preserve"> (los de la segunda página)</w:t>
-      </w:r>
-      <w:r>
-        <w:rPr>
-          <w:sz w:val="22"/>
-          <w:szCs w:val="22"/>
-          <w:lang w:val="es-ES_tradnl"/>
-        </w:rPr>
-        <w:t xml:space="preserve">, </w:t>
-      </w:r>
-      <w:r>
-        <w:rPr>
-          <w:sz w:val="22"/>
-          <w:szCs w:val="22"/>
-          <w:lang w:val="es-ES_tradnl"/>
-        </w:rPr>
-        <w:t>Contacto</w:t>
-      </w:r>
-      <w:r>
-        <w:rPr>
-          <w:sz w:val="22"/>
-          <w:szCs w:val="22"/>
-          <w:lang w:val="es-ES_tradnl"/>
-        </w:rPr>
-        <w:t xml:space="preserve">. La segunda página contiene </w:t>
-      </w:r>
-      <w:r>
-        <w:rPr>
-          <w:sz w:val="22"/>
-          <w:szCs w:val="22"/>
-          <w:lang w:val="es-ES_tradnl"/>
-        </w:rPr>
-        <w:t xml:space="preserve">toda mi galería de proyectos y al final mi contacto, mientras que en la primera </w:t>
-      </w:r>
-      <w:r>
-        <w:rPr>
-          <w:sz w:val="22"/>
-          <w:szCs w:val="22"/>
-          <w:lang w:val="es-ES_tradnl"/>
-        </w:rPr>
-        <w:t xml:space="preserve">se mantiene el </w:t>
-      </w:r>
-      <w:r>
-        <w:rPr>
-          <w:sz w:val="22"/>
-          <w:szCs w:val="22"/>
-          <w:lang w:val="es-ES_tradnl"/>
-        </w:rPr>
-        <w:t xml:space="preserve">Inicio, </w:t>
-      </w:r>
-      <w:r>
-        <w:rPr>
-          <w:sz w:val="22"/>
-          <w:szCs w:val="22"/>
-          <w:lang w:val="es-ES_tradnl"/>
-        </w:rPr>
-        <w:t xml:space="preserve">Sobre mí, una sección especial de </w:t>
-      </w:r>
-      <w:r>
-        <w:rPr>
-          <w:sz w:val="22"/>
-          <w:szCs w:val="22"/>
-          <w:lang w:val="es-ES_tradnl"/>
-        </w:rPr>
-        <w:t xml:space="preserve">Mis </w:t>
-      </w:r>
-      <w:r>
-        <w:rPr>
-          <w:sz w:val="22"/>
-          <w:szCs w:val="22"/>
-          <w:lang w:val="es-ES_tradnl"/>
-        </w:rPr>
-        <w:t>P</w:t>
-      </w:r>
-      <w:r>
-        <w:rPr>
-          <w:sz w:val="22"/>
-          <w:szCs w:val="22"/>
-          <w:lang w:val="es-ES_tradnl"/>
-        </w:rPr>
-        <w:t>royectos destacados y contacto de nuevo. E</w:t>
-      </w:r>
-      <w:r>
-        <w:rPr>
-          <w:sz w:val="22"/>
-          <w:szCs w:val="22"/>
-          <w:lang w:val="es-ES_tradnl"/>
-        </w:rPr>
-        <w:t>l</w:t>
-      </w:r>
-      <w:r>
-        <w:rPr>
-          <w:sz w:val="22"/>
-          <w:szCs w:val="22"/>
-          <w:lang w:val="es-ES_tradnl"/>
-        </w:rPr>
-        <w:t xml:space="preserve"> cursor </w:t>
-      </w:r>
-      <w:r>
-        <w:rPr>
-          <w:sz w:val="22"/>
-          <w:szCs w:val="22"/>
-          <w:lang w:val="es-ES_tradnl"/>
-        </w:rPr>
-        <w:t xml:space="preserve">en toda </w:t>
-      </w:r>
-      <w:r>
-        <w:rPr>
-          <w:sz w:val="22"/>
-          <w:szCs w:val="22"/>
-          <w:lang w:val="es-ES_tradnl"/>
-        </w:rPr>
-        <w:t>mi</w:t>
-      </w:r>
-      <w:r>
-        <w:rPr>
-          <w:sz w:val="22"/>
-          <w:szCs w:val="22"/>
-          <w:lang w:val="es-ES_tradnl"/>
-        </w:rPr>
-        <w:t xml:space="preserve"> página es personalizado</w:t>
-      </w:r>
-      <w:r>
-        <w:rPr>
-          <w:sz w:val="22"/>
-          <w:szCs w:val="22"/>
-          <w:lang w:val="es-ES_tradnl"/>
-        </w:rPr>
-        <w:t>.</w:t>
-      </w:r>
-      <w:r>
-        <w:rPr>
-          <w:sz w:val="22"/>
-          <w:szCs w:val="22"/>
-          <w:lang w:val="es-ES_tradnl"/>
-        </w:rPr>
-        <w:t xml:space="preserve"> </w:t>
-      </w:r>
-    </w:p>
-    <w:p>
-      <w:pPr>
-        <w:rPr>
-          <w:sz w:val="22"/>
-          <w:szCs w:val="22"/>
-          <w:lang w:val="es-ES_tradnl"/>
-        </w:rPr>
-      </w:pPr>
-      <w:r>
-        <w:rPr>
-          <w:sz w:val="22"/>
-          <w:szCs w:val="22"/>
-          <w:lang w:val="es-ES_tradnl"/>
-        </w:rPr>
-        <w:t xml:space="preserve">El orden va: primero un inicio, pequeña introducción, luego sobre mí, </w:t>
-      </w:r>
-      <w:r>
-        <w:rPr>
-          <w:sz w:val="22"/>
-          <w:szCs w:val="22"/>
-          <w:lang w:val="es-ES_tradnl"/>
-        </w:rPr>
-        <w:t>después la sección más larga la de mis proyec</w:t>
-      </w:r>
-      <w:r>
-        <w:rPr>
-          <w:sz w:val="22"/>
-          <w:szCs w:val="22"/>
-          <w:lang w:val="es-ES_tradnl"/>
-        </w:rPr>
-        <w:t>tos y, por último, cómo contactarme. Todo debe ser responsivo y aplicar mi sistema de diseño.</w:t>
-      </w:r>
-    </w:p>
-    <w:p>
-      <w:pPr>
-        <w:rPr>
-          <w:b/>
-          <w:bCs/>
-          <w:sz w:val="32"/>
-          <w:szCs w:val="32"/>
-          <w:lang w:val="es-ES_tradnl"/>
-        </w:rPr>
-      </w:pPr>
-      <w:r>
-        <w:rPr>
-          <w:b/>
-          <w:bCs/>
-          <w:sz w:val="32"/>
-          <w:szCs w:val="32"/>
-          <w:lang w:val="es-ES_tradnl"/>
-        </w:rPr>
-        <w:t xml:space="preserve">2. </w:t>
-      </w:r>
-      <w:r>
-        <w:rPr>
-          <w:b/>
-          <w:bCs/>
-          <w:sz w:val="32"/>
-          <w:szCs w:val="32"/>
-          <w:lang w:val="es-ES_tradnl"/>
-        </w:rPr>
-        <w:t>Inicio (</w:t>
-      </w:r>
-      <w:proofErr w:type="spellStart"/>
-      <w:r>
-        <w:rPr>
-          <w:b/>
-          <w:bCs/>
-          <w:sz w:val="32"/>
-          <w:szCs w:val="32"/>
-          <w:lang w:val="es-ES_tradnl"/>
-        </w:rPr>
-        <w:t>hero</w:t>
-      </w:r>
-      <w:proofErr w:type="spellEnd"/>
-      <w:r>
-        <w:rPr>
-          <w:b/>
-          <w:bCs/>
-          <w:sz w:val="32"/>
-          <w:szCs w:val="32"/>
-          <w:lang w:val="es-ES_tradnl"/>
-        </w:rPr>
-        <w:t>)</w:t>
-      </w:r>
-    </w:p>
-    <w:p>
-      <w:pPr>
-        <w:rPr>
-          <w:sz w:val="22"/>
-          <w:szCs w:val="22"/>
-          <w:lang w:val="es-ES_tradnl"/>
-        </w:rPr>
-      </w:pPr>
-      <w:r>
-        <w:rPr>
-          <w:sz w:val="22"/>
-          <w:szCs w:val="22"/>
-          <w:lang w:val="es-ES_tradnl"/>
-        </w:rPr>
-        <w:t xml:space="preserve">La primera pantalla es un </w:t>
-      </w:r>
-      <w:proofErr w:type="spellStart"/>
-      <w:r>
-        <w:rPr>
-          <w:sz w:val="22"/>
-          <w:szCs w:val="22"/>
-          <w:lang w:val="es-ES_tradnl"/>
-        </w:rPr>
-        <w:t>hero</w:t>
-      </w:r>
-      <w:proofErr w:type="spellEnd"/>
-      <w:r>
-        <w:rPr>
-          <w:sz w:val="22"/>
-          <w:szCs w:val="22"/>
-          <w:lang w:val="es-ES_tradnl"/>
-        </w:rPr>
-        <w:t xml:space="preserve"> de una columna: en el centro está mi logo en grande y debajo del logo hay un texto con una línea de saludo</w:t>
-      </w:r>
-      <w:r>
-        <w:rPr>
-          <w:sz w:val="22"/>
-          <w:szCs w:val="22"/>
-          <w:lang w:val="es-ES_tradnl"/>
-        </w:rPr>
-        <w:t xml:space="preserve"> (“</w:t>
-      </w:r>
-      <w:r>
-        <w:rPr>
-          <w:sz w:val="22"/>
-          <w:szCs w:val="22"/>
-        </w:rPr>
-        <w:t>Transformo ideas en experiencias visuales claras, vibrantes y con personalidad</w:t>
-      </w:r>
-      <w:proofErr w:type="gramStart"/>
-      <w:r>
-        <w:rPr>
-          <w:sz w:val="22"/>
-          <w:szCs w:val="22"/>
-          <w:lang w:val="es-ES_tradnl"/>
-        </w:rPr>
-        <w:t>”</w:t>
-      </w:r>
-      <w:r>
-        <w:rPr>
-          <w:sz w:val="22"/>
-          <w:szCs w:val="22"/>
-          <w:lang w:val="es-ES_tradnl"/>
-        </w:rPr>
-        <w:t xml:space="preserve"> )</w:t>
-      </w:r>
-      <w:proofErr w:type="gramEnd"/>
-      <w:r>
-        <w:rPr>
-          <w:sz w:val="22"/>
-          <w:szCs w:val="22"/>
-          <w:lang w:val="es-ES_tradnl"/>
-        </w:rPr>
-        <w:t>, detrás esta la animación horizontal de la forma orgánica</w:t>
-      </w:r>
-      <w:r>
-        <w:rPr>
-          <w:sz w:val="22"/>
-          <w:szCs w:val="22"/>
-          <w:lang w:val="es-ES_tradnl"/>
-        </w:rPr>
-        <w:t xml:space="preserve">, pero no compite con el logo y la línea de saludo. </w:t>
-      </w:r>
-    </w:p>
-    <w:p>
-      <w:pPr>
-        <w:rPr>
-          <w:sz w:val="22"/>
-          <w:szCs w:val="22"/>
-          <w:lang w:val="es-ES_tradnl"/>
-        </w:rPr>
-      </w:pPr>
-      <w:r>
-        <w:rPr>
-          <w:sz w:val="22"/>
-          <w:szCs w:val="22"/>
-          <w:lang w:val="es-ES_tradnl"/>
-        </w:rPr>
-        <w:t>Debajo van dos botones – uno primario “Conóceme”, que lleva a Sobre mí</w:t>
-      </w:r>
-      <w:r>
-        <w:rPr>
-          <w:sz w:val="22"/>
-          <w:szCs w:val="22"/>
-          <w:lang w:val="es-ES_tradnl"/>
-        </w:rPr>
-        <w:t xml:space="preserve"> </w:t>
-      </w:r>
-      <w:r>
-        <w:rPr>
-          <w:rFonts w:ascii="Calibri" w:eastAsia="Calibri" w:hAnsi="Calibri" w:cs="Calibri"/>
-          <w:color w:val="202225"/>
-          <w:sz w:val="22"/>
-          <w:szCs w:val="22"/>
-        </w:rPr>
-        <w:t>y una fila con mis íconos de redes (los enlaces completos están en la sección de Contacto)</w:t>
-      </w:r>
-      <w:r>
-        <w:rPr>
-          <w:rFonts w:ascii="Calibri" w:eastAsia="Calibri" w:hAnsi="Calibri" w:cs="Calibri"/>
-          <w:color w:val="202225"/>
-          <w:sz w:val="22"/>
-          <w:szCs w:val="22"/>
-        </w:rPr>
-        <w:t>. En móvil, se mantienen centrados los elementos.</w:t>
-      </w:r>
-    </w:p>
-    <w:p>
-      <w:pPr>
-        <w:rPr>
-          <w:b/>
-          <w:bCs/>
-          <w:sz w:val="32"/>
-          <w:szCs w:val="32"/>
-          <w:lang w:val="es-ES_tradnl"/>
-        </w:rPr>
-      </w:pPr>
-      <w:r>
-        <w:rPr>
-          <w:b/>
-          <w:bCs/>
-          <w:sz w:val="32"/>
-          <w:szCs w:val="32"/>
-          <w:lang w:val="es-ES_tradnl"/>
-        </w:rPr>
-        <w:t xml:space="preserve">3. </w:t>
-      </w:r>
-      <w:r>
-        <w:rPr>
-          <w:b/>
-          <w:bCs/>
-          <w:sz w:val="32"/>
-          <w:szCs w:val="32"/>
-          <w:lang w:val="es-ES_tradnl"/>
-        </w:rPr>
-        <w:t>Sobre mí</w:t>
-      </w:r>
-    </w:p>
-    <w:p>
-      <w:pPr>
-        <w:rPr>
-          <w:sz w:val="22"/>
-          <w:szCs w:val="22"/>
-        </w:rPr>
-      </w:pPr>
-      <w:r>
-        <w:rPr>
-          <w:sz w:val="22"/>
-          <w:szCs w:val="22"/>
-        </w:rPr>
-        <w:t xml:space="preserve">Una sección de presentación en dos columnas: a </w:t>
-      </w:r>
-      <w:r>
-        <w:rPr>
-          <w:sz w:val="22"/>
-          <w:szCs w:val="22"/>
-          <w:lang w:val="es-ES_tradnl"/>
-        </w:rPr>
-        <w:t>la derecha está el gif de mi foto-</w:t>
-      </w:r>
-      <w:proofErr w:type="spellStart"/>
-      <w:r>
-        <w:rPr>
-          <w:sz w:val="22"/>
-          <w:szCs w:val="22"/>
-          <w:lang w:val="es-ES_tradnl"/>
-        </w:rPr>
-        <w:t>mia</w:t>
-      </w:r>
-      <w:proofErr w:type="spellEnd"/>
-      <w:r>
-        <w:rPr>
-          <w:sz w:val="22"/>
-          <w:szCs w:val="22"/>
-          <w:lang w:val="es-ES_tradnl"/>
-        </w:rPr>
-        <w:t xml:space="preserve">, y a la </w:t>
-      </w:r>
-      <w:r>
-        <w:rPr>
-          <w:sz w:val="22"/>
-          <w:szCs w:val="22"/>
-          <w:lang w:val="es-ES_tradnl"/>
-        </w:rPr>
-        <w:t>izquierda esta mi presentación</w:t>
-      </w:r>
-      <w:r>
-        <w:rPr>
-          <w:sz w:val="22"/>
-          <w:szCs w:val="22"/>
-          <w:lang w:val="es-ES_tradnl"/>
-        </w:rPr>
-        <w:t xml:space="preserve">. </w:t>
-      </w:r>
-      <w:r>
-        <w:rPr>
-          <w:sz w:val="22"/>
-          <w:szCs w:val="22"/>
-        </w:rPr>
-        <w:t xml:space="preserve">Soy </w:t>
-      </w:r>
-      <w:r>
-        <w:rPr>
-          <w:sz w:val="22"/>
-          <w:szCs w:val="22"/>
-        </w:rPr>
-        <w:t>V</w:t>
-      </w:r>
-      <w:r>
-        <w:rPr>
-          <w:sz w:val="22"/>
-          <w:szCs w:val="22"/>
-        </w:rPr>
-        <w:t>aleria Victoria</w:t>
-      </w:r>
-      <w:r>
-        <w:rPr>
-          <w:sz w:val="22"/>
-          <w:szCs w:val="22"/>
-        </w:rPr>
-        <w:t xml:space="preserve">, diseñadora gráfica digital y estudiante de la Universidad La Salle. Me interesa desarrollar proyectos de identidad visual, diseño editorial, UX/UI y </w:t>
-      </w:r>
-      <w:r>
-        <w:rPr>
-          <w:sz w:val="22"/>
-          <w:szCs w:val="22"/>
-        </w:rPr>
-        <w:t>de todo un poco</w:t>
-      </w:r>
-      <w:r>
-        <w:rPr>
-          <w:sz w:val="22"/>
-          <w:szCs w:val="22"/>
-        </w:rPr>
-        <w:t xml:space="preserve">, </w:t>
-      </w:r>
-      <w:r>
-        <w:rPr>
-          <w:sz w:val="22"/>
-          <w:szCs w:val="22"/>
-        </w:rPr>
-        <w:t xml:space="preserve">amo seguir aprendiendo nuevas cosas y explorando campos nuevos, </w:t>
-      </w:r>
-      <w:r>
-        <w:rPr>
-          <w:sz w:val="22"/>
-          <w:szCs w:val="22"/>
-        </w:rPr>
-        <w:t>combinando creatividad, organización y estrategia.</w:t>
-      </w:r>
-    </w:p>
-    <w:p>
-      <w:pPr>
-        <w:rPr>
-          <w:sz w:val="22"/>
-          <w:szCs w:val="22"/>
-        </w:rPr>
-      </w:pPr>
-      <w:r>
-        <w:rPr>
-          <w:sz w:val="22"/>
-          <w:szCs w:val="22"/>
-        </w:rPr>
-        <w:t xml:space="preserve">Explico que soy una persona curiosa, que disfruta comprender el propósito detrás de cada proyecto, explorar nuevas herramientas y transformar ideas en soluciones visuales claras y con personalidad. </w:t>
-      </w:r>
-      <w:r>
-        <w:rPr>
-          <w:sz w:val="22"/>
-          <w:szCs w:val="22"/>
-        </w:rPr>
-        <w:t xml:space="preserve">El diseño se trata de configurar nuevas experiencias y </w:t>
-      </w:r>
-      <w:r>
-        <w:rPr>
-          <w:sz w:val="22"/>
-          <w:szCs w:val="22"/>
-        </w:rPr>
-        <w:t>medios</w:t>
-      </w:r>
-      <w:r>
-        <w:rPr>
-          <w:sz w:val="22"/>
-          <w:szCs w:val="22"/>
-        </w:rPr>
-        <w:t>, juga</w:t>
-      </w:r>
-      <w:r>
-        <w:rPr>
-          <w:sz w:val="22"/>
-          <w:szCs w:val="22"/>
-        </w:rPr>
-        <w:t>ndo</w:t>
-      </w:r>
-      <w:r>
-        <w:rPr>
-          <w:sz w:val="22"/>
-          <w:szCs w:val="22"/>
-        </w:rPr>
-        <w:t xml:space="preserve"> con figuras</w:t>
-      </w:r>
-      <w:r>
-        <w:rPr>
-          <w:sz w:val="22"/>
-          <w:szCs w:val="22"/>
-        </w:rPr>
-        <w:t xml:space="preserve"> se puede</w:t>
-      </w:r>
-      <w:r>
-        <w:rPr>
-          <w:sz w:val="22"/>
-          <w:szCs w:val="22"/>
-        </w:rPr>
-        <w:t xml:space="preserve"> crear algo memorable</w:t>
-      </w:r>
-      <w:r>
-        <w:rPr>
-          <w:sz w:val="22"/>
-          <w:szCs w:val="22"/>
-        </w:rPr>
-        <w:t>.</w:t>
-      </w:r>
-    </w:p>
-    <w:p>
-      <w:pPr>
-        <w:rPr>
-          <w:sz w:val="22"/>
-          <w:szCs w:val="22"/>
-        </w:rPr>
-      </w:pPr>
-      <w:r>
-        <w:rPr>
-          <w:sz w:val="22"/>
-          <w:szCs w:val="22"/>
-        </w:rPr>
-        <w:t>Debajo de mi presentación aparecen dos grupos de tarjetas interactivas. Las tarjetas de educación muestran mi formación académica mediante fondos de color y texto blanco</w:t>
-      </w:r>
-      <w:r>
-        <w:rPr>
-          <w:sz w:val="22"/>
-          <w:szCs w:val="22"/>
-        </w:rPr>
-        <w:t>:</w:t>
+        <w:t>Proyectos</w:t>
+      </w:r>
+    </w:p>
+    <w:p>
+      <w:pPr>
+        <w:rPr>
+          <w:rFonts w:ascii="Aptos" w:hAnsi="Aptos"/>
+          <w:sz w:val="22"/>
+          <w:szCs w:val="22"/>
+        </w:rPr>
+      </w:pPr>
+      <w:r>
+        <w:rPr>
+          <w:rFonts w:ascii="Aptos" w:hAnsi="Aptos"/>
+          <w:sz w:val="22"/>
+          <w:szCs w:val="22"/>
+        </w:rPr>
+        <w:t xml:space="preserve">Proyectos es una sección </w:t>
+      </w:r>
+      <w:r>
+        <w:rPr>
+          <w:rFonts w:ascii="Aptos" w:hAnsi="Aptos"/>
+          <w:sz w:val="22"/>
+          <w:szCs w:val="22"/>
+        </w:rPr>
+        <w:t xml:space="preserve">que </w:t>
+      </w:r>
+      <w:r>
+        <w:rPr>
+          <w:rFonts w:ascii="Aptos" w:hAnsi="Aptos"/>
+          <w:sz w:val="22"/>
+          <w:szCs w:val="22"/>
+        </w:rPr>
+        <w:t xml:space="preserve">reuné </w:t>
+      </w:r>
+      <w:r>
+        <w:rPr>
+          <w:rFonts w:ascii="Aptos" w:hAnsi="Aptos"/>
+          <w:sz w:val="22"/>
+          <w:szCs w:val="22"/>
+        </w:rPr>
+        <w:t>una selección de trabajos de Identidad, Ilustración, Campañas, UX/UI, Diseño editorial y Modelado 3D. Se presenta al menos un proyecto representativo por categoría.</w:t>
+      </w:r>
+    </w:p>
+    <w:p>
+      <w:pPr>
+        <w:rPr>
+          <w:rFonts w:ascii="Aptos" w:hAnsi="Aptos"/>
+          <w:sz w:val="22"/>
+          <w:szCs w:val="22"/>
+        </w:rPr>
+      </w:pPr>
+      <w:r>
+        <w:rPr>
+          <w:rFonts w:ascii="Aptos" w:hAnsi="Aptos"/>
+          <w:sz w:val="22"/>
+          <w:szCs w:val="22"/>
+        </w:rPr>
+        <w:t>Cada proyecto debe contener la información siguiente:</w:t>
       </w:r>
     </w:p>
     <w:p>
@@ -963,22 +1626,21 @@
         <w:pStyle w:val="Prrafodelista"/>
         <w:numPr>
           <w:ilvl w:val="0"/>
-          <w:numId w:val="4"/>
+          <w:numId w:val="7"/>
         </w:numPr>
         <w:rPr>
-          <w:sz w:val="22"/>
-          <w:szCs w:val="22"/>
-          <w:lang w:val="es-ES_tradnl"/>
-        </w:rPr>
-      </w:pPr>
-      <w:r>
-        <w:rPr>
-          <w:sz w:val="22"/>
-          <w:szCs w:val="22"/>
-          <w:lang w:val="es-ES_tradnl"/>
-        </w:rPr>
-        <w:lastRenderedPageBreak/>
-        <w:t>Licenciatura en Diseño Gráfico Digital 2023-2027</w:t>
+          <w:rFonts w:ascii="Aptos" w:hAnsi="Aptos"/>
+          <w:sz w:val="22"/>
+          <w:szCs w:val="22"/>
+        </w:rPr>
+      </w:pPr>
+      <w:r>
+        <w:rPr>
+          <w:rFonts w:ascii="Aptos" w:hAnsi="Aptos"/>
+          <w:sz w:val="22"/>
+          <w:szCs w:val="22"/>
+        </w:rPr>
+        <w:t>Nombre del proyecto y categoría.</w:t>
       </w:r>
     </w:p>
     <w:p>
@@ -986,21 +1648,21 @@
         <w:pStyle w:val="Prrafodelista"/>
         <w:numPr>
           <w:ilvl w:val="0"/>
-          <w:numId w:val="4"/>
+          <w:numId w:val="7"/>
         </w:numPr>
         <w:rPr>
-          <w:sz w:val="22"/>
-          <w:szCs w:val="22"/>
-          <w:lang w:val="es-ES_tradnl"/>
-        </w:rPr>
-      </w:pPr>
-      <w:r>
-        <w:rPr>
-          <w:sz w:val="22"/>
-          <w:szCs w:val="22"/>
-          <w:lang w:val="es-ES_tradnl"/>
-        </w:rPr>
-        <w:t>Intercambio en el extranjero a Irlanda del Norte 2026</w:t>
+          <w:rFonts w:ascii="Aptos" w:hAnsi="Aptos"/>
+          <w:sz w:val="22"/>
+          <w:szCs w:val="22"/>
+        </w:rPr>
+      </w:pPr>
+      <w:r>
+        <w:rPr>
+          <w:rFonts w:ascii="Aptos" w:hAnsi="Aptos"/>
+          <w:sz w:val="22"/>
+          <w:szCs w:val="22"/>
+        </w:rPr>
+        <w:t>Año de realización y mi rol o participación.</w:t>
       </w:r>
     </w:p>
     <w:p>
@@ -1008,128 +1670,21 @@
         <w:pStyle w:val="Prrafodelista"/>
         <w:numPr>
           <w:ilvl w:val="0"/>
-          <w:numId w:val="4"/>
+          <w:numId w:val="7"/>
         </w:numPr>
         <w:rPr>
-          <w:sz w:val="22"/>
-          <w:szCs w:val="22"/>
-          <w:lang w:val="es-ES_tradnl"/>
-        </w:rPr>
-      </w:pPr>
-      <w:r>
-        <w:rPr>
-          <w:sz w:val="22"/>
-          <w:szCs w:val="22"/>
-          <w:lang w:val="es-ES_tradnl"/>
-        </w:rPr>
-        <w:t xml:space="preserve">Finalista en concurso </w:t>
-      </w:r>
-      <w:proofErr w:type="spellStart"/>
-      <w:proofErr w:type="gramStart"/>
-      <w:r>
-        <w:rPr>
-          <w:i/>
-          <w:iCs/>
-          <w:sz w:val="22"/>
-          <w:szCs w:val="22"/>
-          <w:lang w:val="es-ES_tradnl"/>
-        </w:rPr>
-        <w:t>a!diseño</w:t>
-      </w:r>
-      <w:proofErr w:type="spellEnd"/>
-      <w:proofErr w:type="gramEnd"/>
-      <w:r>
-        <w:rPr>
-          <w:i/>
-          <w:iCs/>
-          <w:sz w:val="22"/>
-          <w:szCs w:val="22"/>
-          <w:lang w:val="es-ES_tradnl"/>
-        </w:rPr>
-        <w:t xml:space="preserve"> 2026</w:t>
-      </w:r>
-      <w:r>
-        <w:rPr>
-          <w:sz w:val="22"/>
-          <w:szCs w:val="22"/>
-          <w:lang w:val="es-ES_tradnl"/>
-        </w:rPr>
-        <w:t xml:space="preserve"> en </w:t>
-      </w:r>
-      <w:r>
-        <w:rPr>
-          <w:sz w:val="22"/>
-          <w:szCs w:val="22"/>
-          <w:lang w:val="es-ES_tradnl"/>
-        </w:rPr>
-        <w:t xml:space="preserve">identidad de </w:t>
-      </w:r>
-      <w:r>
-        <w:rPr>
-          <w:sz w:val="22"/>
-          <w:szCs w:val="22"/>
-          <w:lang w:val="es-ES_tradnl"/>
-        </w:rPr>
-        <w:t>marca</w:t>
-      </w:r>
-      <w:r>
-        <w:rPr>
-          <w:sz w:val="22"/>
-          <w:szCs w:val="22"/>
-          <w:lang w:val="es-ES_tradnl"/>
-        </w:rPr>
-        <w:t xml:space="preserve"> y </w:t>
-      </w:r>
-      <w:r>
-        <w:rPr>
-          <w:sz w:val="22"/>
-          <w:szCs w:val="22"/>
-          <w:lang w:val="es-ES_tradnl"/>
-        </w:rPr>
-        <w:t>tipografía</w:t>
-      </w:r>
-    </w:p>
-    <w:p>
-      <w:pPr>
-        <w:rPr>
-          <w:sz w:val="22"/>
-          <w:szCs w:val="22"/>
-        </w:rPr>
-      </w:pPr>
-      <w:r>
-        <w:rPr>
-          <w:sz w:val="22"/>
-          <w:szCs w:val="22"/>
-        </w:rPr>
-        <w:t>M</w:t>
-      </w:r>
-      <w:r>
-        <w:rPr>
-          <w:sz w:val="22"/>
-          <w:szCs w:val="22"/>
-        </w:rPr>
-        <w:t>ientras que las tarjetas de habilidades organizan mis conocimiento</w:t>
-      </w:r>
-      <w:r>
-        <w:rPr>
-          <w:sz w:val="22"/>
-          <w:szCs w:val="22"/>
-        </w:rPr>
-        <w:t>s</w:t>
-      </w:r>
-      <w:r>
-        <w:rPr>
-          <w:sz w:val="22"/>
-          <w:szCs w:val="22"/>
-        </w:rPr>
-        <w:t>, con una foto ejemplo de cada categoría</w:t>
-      </w:r>
-      <w:r>
-        <w:rPr>
-          <w:sz w:val="22"/>
-          <w:szCs w:val="22"/>
-        </w:rPr>
-        <w:t>:</w:t>
+          <w:rFonts w:ascii="Aptos" w:hAnsi="Aptos"/>
+          <w:sz w:val="22"/>
+          <w:szCs w:val="22"/>
+        </w:rPr>
+      </w:pPr>
+      <w:r>
+        <w:rPr>
+          <w:rFonts w:ascii="Aptos" w:hAnsi="Aptos"/>
+          <w:sz w:val="22"/>
+          <w:szCs w:val="22"/>
+        </w:rPr>
+        <w:t>Descripción breve del objetivo y del resultado.</w:t>
       </w:r>
     </w:p>
     <w:p>
@@ -1137,19 +1692,21 @@
         <w:pStyle w:val="Prrafodelista"/>
         <w:numPr>
           <w:ilvl w:val="0"/>
-          <w:numId w:val="5"/>
+          <w:numId w:val="7"/>
         </w:numPr>
-        <w:spacing w:after="70" w:line="240" w:lineRule="auto"/>
-        <w:contextualSpacing w:val="0"/>
-      </w:pPr>
-      <w:r>
-        <w:rPr>
-          <w:rFonts w:ascii="Calibri" w:eastAsia="Calibri" w:hAnsi="Calibri" w:cs="Calibri"/>
-          <w:color w:val="202225"/>
-          <w:sz w:val="22"/>
-          <w:szCs w:val="22"/>
-        </w:rPr>
-        <w:t>Diseño de Identidad</w:t>
+        <w:rPr>
+          <w:rFonts w:ascii="Aptos" w:hAnsi="Aptos"/>
+          <w:sz w:val="22"/>
+          <w:szCs w:val="22"/>
+        </w:rPr>
+      </w:pPr>
+      <w:r>
+        <w:rPr>
+          <w:rFonts w:ascii="Aptos" w:hAnsi="Aptos"/>
+          <w:sz w:val="22"/>
+          <w:szCs w:val="22"/>
+        </w:rPr>
+        <w:t>Etiquetas relacionadas con disciplina, herramientas o entregables.</w:t>
       </w:r>
     </w:p>
     <w:p>
@@ -1157,213 +1714,84 @@
         <w:pStyle w:val="Prrafodelista"/>
         <w:numPr>
           <w:ilvl w:val="0"/>
-          <w:numId w:val="5"/>
+          <w:numId w:val="7"/>
         </w:numPr>
-        <w:spacing w:after="70" w:line="240" w:lineRule="auto"/>
-        <w:contextualSpacing w:val="0"/>
-      </w:pPr>
-      <w:r>
-        <w:rPr>
-          <w:rFonts w:ascii="Calibri" w:eastAsia="Calibri" w:hAnsi="Calibri" w:cs="Calibri"/>
-          <w:color w:val="202225"/>
-          <w:sz w:val="22"/>
-          <w:szCs w:val="22"/>
-        </w:rPr>
-        <w:t>Ilustración</w:t>
-      </w:r>
-    </w:p>
-    <w:p>
-      <w:pPr>
-        <w:pStyle w:val="Prrafodelista"/>
-        <w:numPr>
-          <w:ilvl w:val="0"/>
-          <w:numId w:val="5"/>
-        </w:numPr>
-        <w:spacing w:after="70" w:line="240" w:lineRule="auto"/>
-        <w:contextualSpacing w:val="0"/>
-      </w:pPr>
-      <w:r>
-        <w:rPr>
-          <w:rFonts w:ascii="Calibri" w:eastAsia="Calibri" w:hAnsi="Calibri" w:cs="Calibri"/>
-          <w:color w:val="202225"/>
-          <w:sz w:val="22"/>
-          <w:szCs w:val="22"/>
-        </w:rPr>
-        <w:t>Campañas</w:t>
-      </w:r>
-    </w:p>
-    <w:p>
-      <w:pPr>
-        <w:pStyle w:val="Prrafodelista"/>
-        <w:numPr>
-          <w:ilvl w:val="0"/>
-          <w:numId w:val="5"/>
-        </w:numPr>
-        <w:spacing w:after="70" w:line="240" w:lineRule="auto"/>
-        <w:contextualSpacing w:val="0"/>
-      </w:pPr>
-      <w:r>
-        <w:rPr>
-          <w:rFonts w:ascii="Calibri" w:eastAsia="Calibri" w:hAnsi="Calibri" w:cs="Calibri"/>
-          <w:color w:val="202225"/>
-          <w:sz w:val="22"/>
-          <w:szCs w:val="22"/>
-        </w:rPr>
-        <w:t>Diseño UX/UI</w:t>
-      </w:r>
-    </w:p>
-    <w:p>
-      <w:pPr>
-        <w:pStyle w:val="Prrafodelista"/>
-        <w:numPr>
-          <w:ilvl w:val="0"/>
-          <w:numId w:val="5"/>
-        </w:numPr>
-        <w:spacing w:after="70" w:line="240" w:lineRule="auto"/>
-        <w:contextualSpacing w:val="0"/>
-      </w:pPr>
-      <w:r>
-        <w:rPr>
-          <w:rFonts w:ascii="Calibri" w:eastAsia="Calibri" w:hAnsi="Calibri" w:cs="Calibri"/>
-          <w:color w:val="202225"/>
-          <w:sz w:val="22"/>
-          <w:szCs w:val="22"/>
-        </w:rPr>
-        <w:t>Diseño editorial</w:t>
-      </w:r>
-    </w:p>
-    <w:p>
-      <w:pPr>
-        <w:pStyle w:val="Prrafodelista"/>
-        <w:numPr>
-          <w:ilvl w:val="0"/>
-          <w:numId w:val="5"/>
-        </w:numPr>
-        <w:spacing w:after="70" w:line="240" w:lineRule="auto"/>
-        <w:contextualSpacing w:val="0"/>
-      </w:pPr>
-      <w:r>
-        <w:rPr>
-          <w:rFonts w:ascii="Calibri" w:eastAsia="Calibri" w:hAnsi="Calibri" w:cs="Calibri"/>
-          <w:color w:val="202225"/>
-          <w:sz w:val="22"/>
-          <w:szCs w:val="22"/>
-        </w:rPr>
-        <w:t>Modelado 3D</w:t>
-      </w:r>
-    </w:p>
-    <w:p>
-      <w:pPr>
-        <w:pStyle w:val="Prrafodelista"/>
-        <w:spacing w:after="70" w:line="240" w:lineRule="auto"/>
-        <w:ind w:left="460"/>
-        <w:contextualSpacing w:val="0"/>
-      </w:pPr>
-    </w:p>
-    <w:p>
-      <w:pPr>
-        <w:rPr>
-          <w:sz w:val="22"/>
-          <w:szCs w:val="22"/>
-        </w:rPr>
-      </w:pPr>
-      <w:r>
-        <w:rPr>
-          <w:sz w:val="22"/>
-          <w:szCs w:val="22"/>
-        </w:rPr>
-        <w:t>En escritorio pueden arrastrars</w:t>
-      </w:r>
-      <w:r>
-        <w:rPr>
-          <w:sz w:val="22"/>
-          <w:szCs w:val="22"/>
-        </w:rPr>
-        <w:t xml:space="preserve">e con drag, como un loop. </w:t>
-      </w:r>
-      <w:r>
-        <w:rPr>
-          <w:sz w:val="22"/>
-          <w:szCs w:val="22"/>
-        </w:rPr>
-        <w:t>En móvil se presentan como carruseles horizontales que pueden recorrerse con el dedo.</w:t>
-      </w:r>
-    </w:p>
-    <w:p>
-      <w:pPr>
-        <w:rPr>
-          <w:b/>
-          <w:bCs/>
-          <w:sz w:val="32"/>
-          <w:szCs w:val="32"/>
+        <w:rPr>
+          <w:rFonts w:ascii="Aptos" w:hAnsi="Aptos"/>
+          <w:sz w:val="22"/>
+          <w:szCs w:val="22"/>
+        </w:rPr>
+      </w:pPr>
+      <w:r>
+        <w:rPr>
+          <w:rFonts w:ascii="Aptos" w:hAnsi="Aptos"/>
+          <w:sz w:val="22"/>
+          <w:szCs w:val="22"/>
+        </w:rPr>
+        <w:t xml:space="preserve">Galería de imágenes y, cuando corresponda, video </w:t>
+      </w:r>
+      <w:r>
+        <w:rPr>
+          <w:rFonts w:ascii="Aptos" w:hAnsi="Aptos"/>
+          <w:sz w:val="22"/>
+          <w:szCs w:val="22"/>
+        </w:rPr>
+        <w:t>mp4.</w:t>
+      </w:r>
+    </w:p>
+    <w:p>
+      <w:pPr>
+        <w:rPr>
+          <w:rFonts w:ascii="Aptos" w:hAnsi="Aptos"/>
+          <w:sz w:val="22"/>
+          <w:szCs w:val="22"/>
+        </w:rPr>
+      </w:pPr>
+      <w:r>
+        <w:rPr>
+          <w:rFonts w:ascii="Aptos" w:hAnsi="Aptos"/>
+          <w:sz w:val="22"/>
+          <w:szCs w:val="22"/>
+        </w:rPr>
+        <w:t>La galería de cada proyecto se desplaza horizontalmente y conserva la proporción completa de las imágenes, sin recortarlas. En móvil se recorre con el dedo. Todo el contenido permanece dentro de #proyectos; no se generan archivos HTML adicionales ni páginas independientes para ampliar cada caso.</w:t>
+      </w:r>
+    </w:p>
+    <w:p>
+      <w:pPr>
+        <w:rPr>
+          <w:rFonts w:ascii="Aptos" w:hAnsi="Aptos"/>
+          <w:b/>
+          <w:bCs/>
+          <w:sz w:val="22"/>
+          <w:szCs w:val="22"/>
           <w:lang w:val="es-ES_tradnl"/>
         </w:rPr>
       </w:pPr>
       <w:r>
         <w:rPr>
-          <w:b/>
-          <w:bCs/>
-          <w:sz w:val="32"/>
-          <w:szCs w:val="32"/>
+          <w:rFonts w:ascii="Aptos" w:hAnsi="Aptos"/>
+          <w:b/>
+          <w:bCs/>
+          <w:sz w:val="22"/>
+          <w:szCs w:val="22"/>
           <w:lang w:val="es-ES_tradnl"/>
         </w:rPr>
-        <w:t>4. Proyectos</w:t>
-      </w:r>
-      <w:r>
-        <w:rPr>
-          <w:b/>
-          <w:bCs/>
-          <w:sz w:val="32"/>
-          <w:szCs w:val="32"/>
-          <w:lang w:val="es-ES_tradnl"/>
-        </w:rPr>
-        <w:t xml:space="preserve"> destacados</w:t>
-      </w:r>
-    </w:p>
-    <w:p>
-      <w:pPr>
-        <w:rPr>
-          <w:b/>
-          <w:bCs/>
-          <w:sz w:val="32"/>
-          <w:szCs w:val="32"/>
-          <w:lang w:val="es-ES_tradnl"/>
-        </w:rPr>
-      </w:pPr>
-      <w:r>
-        <w:rPr>
-          <w:b/>
-          <w:bCs/>
-          <w:sz w:val="32"/>
-          <w:szCs w:val="32"/>
-          <w:lang w:val="es-ES_tradnl"/>
-        </w:rPr>
         <w:t>5. Contacto</w:t>
       </w:r>
     </w:p>
     <w:p>
       <w:pPr>
         <w:rPr>
-          <w:b/>
-          <w:bCs/>
-          <w:sz w:val="32"/>
-          <w:szCs w:val="32"/>
-          <w:lang w:val="es-ES_tradnl"/>
-        </w:rPr>
-      </w:pPr>
-      <w:r>
-        <w:rPr>
-          <w:sz w:val="22"/>
-          <w:szCs w:val="22"/>
-        </w:rPr>
-        <w:t xml:space="preserve">Una sección </w:t>
-      </w:r>
-      <w:r>
-        <w:rPr>
-          <w:sz w:val="22"/>
-          <w:szCs w:val="22"/>
-        </w:rPr>
-        <w:t>con una fila de contactos con ícono. Estos son mis datos y enlaces:</w:t>
+          <w:rFonts w:ascii="Aptos" w:hAnsi="Aptos"/>
+        </w:rPr>
+      </w:pPr>
+      <w:r>
+        <w:rPr>
+          <w:rFonts w:ascii="Aptos" w:eastAsia="Calibri" w:hAnsi="Aptos"/>
+          <w:color w:val="202225"/>
+          <w:sz w:val="22"/>
+        </w:rPr>
+        <w:t>La sección reúne mis medios de contacto en una fila de enlaces con ícono. En móvil, los enlaces se apilan o se distribuyen en varias filas sin alterar su destino.</w:t>
       </w:r>
     </w:p>
     <w:p>
@@ -1628,6 +2056,16 @@
           <w:sz w:val="22"/>
           <w:szCs w:val="22"/>
         </w:rPr>
+      </w:r>
+      <w:r>
+        <w:rPr>
+          <w:rFonts w:ascii="Aptos" w:eastAsia="Calibri" w:hAnsi="Aptos" w:cs="Calibri"/>
+          <w:b/>
+          <w:bCs/>
+          <w:color w:val="202225"/>
+          <w:sz w:val="22"/>
+          <w:szCs w:val="22"/>
+        </w:rPr>
         <w:fldChar w:fldCharType="separate"/>
       </w:r>
     </w:p>
@@ -1660,31 +2098,7 @@
           <w:szCs w:val="22"/>
           <w:lang w:val="en-US"/>
         </w:rPr>
-        <w:t>Instagram</w:t>
-      </w:r>
-      <w:r>
-        <w:rPr>
-          <w:rFonts w:ascii="Aptos" w:eastAsia="Calibri" w:hAnsi="Aptos" w:cs="Calibri"/>
-          <w:b/>
-          <w:bCs/>
-          <w:color w:val="202225"/>
-          <w:sz w:val="22"/>
-          <w:szCs w:val="22"/>
-          <w:lang w:val="en-US"/>
-        </w:rPr>
-        <w:t xml:space="preserve">: </w:t>
-      </w:r>
-      <w:r>
-        <w:rPr>
-          <w:rFonts w:ascii="Aptos" w:eastAsia="Calibri" w:hAnsi="Aptos" w:cs="Calibri"/>
-          <w:b/>
-          <w:bCs/>
-          <w:color w:val="202225"/>
-          <w:sz w:val="22"/>
-          <w:szCs w:val="22"/>
-          <w:lang w:val="en-US"/>
-        </w:rPr>
-        <w:t>@</w:t>
+        <w:t>Instagram: @</w:t>
       </w:r>
       <w:r>
         <w:rPr>
@@ -1695,7 +2109,7 @@
           <w:sz w:val="22"/>
           <w:szCs w:val="22"/>
         </w:rPr>
-        <w:t>_. dob</w:t>
+        <w:t>_. doblev</w:t>
       </w:r>
       <w:r>
         <w:rPr>
@@ -1706,68 +2120,54 @@
           <w:sz w:val="22"/>
           <w:szCs w:val="22"/>
         </w:rPr>
-        <w:t>l</w:t>
-      </w:r>
-      <w:r>
-        <w:rPr>
-          <w:rStyle w:val="Hipervnculo"/>
-          <w:rFonts w:ascii="Aptos" w:eastAsia="Calibri" w:hAnsi="Aptos" w:cs="Calibri"/>
-          <w:b/>
-          <w:bCs/>
-          <w:sz w:val="22"/>
-          <w:szCs w:val="22"/>
-        </w:rPr>
-        <w:t>ev</w:t>
-      </w:r>
-      <w:r>
-        <w:rPr>
-          <w:rStyle w:val="Hipervnculo"/>
-          <w:rFonts w:ascii="Aptos" w:eastAsia="Calibri" w:hAnsi="Aptos" w:cs="Calibri"/>
-          <w:b/>
-          <w:bCs/>
-          <w:sz w:val="22"/>
-          <w:szCs w:val="22"/>
-        </w:rPr>
         <w:t>_</w:t>
       </w:r>
     </w:p>
     <w:p>
       <w:pPr>
         <w:rPr>
+          <w:rFonts w:ascii="Aptos" w:hAnsi="Aptos"/>
+          <w:sz w:val="22"/>
+          <w:szCs w:val="22"/>
           <w:lang w:val="en-US"/>
         </w:rPr>
       </w:pPr>
       <w:r>
         <w:rPr>
+          <w:rFonts w:ascii="Aptos" w:hAnsi="Aptos"/>
+          <w:sz w:val="22"/>
+          <w:szCs w:val="22"/>
           <w:lang w:val="en-US"/>
         </w:rPr>
         <w:fldChar w:fldCharType="end"/>
       </w:r>
-    </w:p>
-    <w:p>
-      <w:pPr>
-        <w:rPr>
-          <w:b/>
-          <w:bCs/>
-          <w:sz w:val="32"/>
-          <w:szCs w:val="32"/>
+      <w:r>
+        <w:rPr>
+          <w:rFonts w:ascii="Aptos" w:hAnsi="Aptos"/>
+          <w:b/>
+          <w:bCs/>
+          <w:sz w:val="22"/>
+          <w:szCs w:val="22"/>
           <w:lang w:val="es-ES_tradnl"/>
         </w:rPr>
-      </w:pPr>
-      <w:r>
-        <w:rPr>
-          <w:b/>
-          <w:bCs/>
-          <w:sz w:val="32"/>
-          <w:szCs w:val="32"/>
+        <w:t>6</w:t>
+      </w:r>
+      <w:r>
+        <w:rPr>
+          <w:rFonts w:ascii="Aptos" w:hAnsi="Aptos"/>
+          <w:b/>
+          <w:bCs/>
+          <w:sz w:val="22"/>
+          <w:szCs w:val="22"/>
           <w:lang w:val="es-ES_tradnl"/>
         </w:rPr>
-        <w:t>4. Mis proyectos</w:t>
-      </w:r>
-    </w:p>
-    <w:p>
-      <w:pPr>
-        <w:rPr>
+        <w:t>. Pie de página</w:t>
+      </w:r>
+    </w:p>
+    <w:p>
+      <w:pPr>
+        <w:rPr>
+          <w:rFonts w:ascii="Aptos" w:hAnsi="Aptos"/>
           <w:sz w:val="22"/>
           <w:szCs w:val="22"/>
           <w:lang w:val="es-ES_tradnl"/>
@@ -1775,178 +2175,24 @@
       </w:pPr>
       <w:r>
         <w:rPr>
-          <w:sz w:val="22"/>
-          <w:szCs w:val="22"/>
-          <w:lang w:val="es-ES_tradnl"/>
-        </w:rPr>
-        <w:t>Es la</w:t>
-      </w:r>
-      <w:r>
-        <w:rPr>
-          <w:sz w:val="22"/>
-          <w:szCs w:val="22"/>
-          <w:lang w:val="es-ES_tradnl"/>
-        </w:rPr>
-        <w:t xml:space="preserve"> segunda página complet</w:t>
-      </w:r>
-      <w:r>
-        <w:rPr>
-          <w:sz w:val="22"/>
-          <w:szCs w:val="22"/>
-          <w:lang w:val="es-ES_tradnl"/>
-        </w:rPr>
-        <w:t>a</w:t>
-      </w:r>
-      <w:r>
-        <w:rPr>
-          <w:sz w:val="22"/>
-          <w:szCs w:val="22"/>
-          <w:lang w:val="es-ES_tradnl"/>
-        </w:rPr>
-        <w:t xml:space="preserve">, </w:t>
-      </w:r>
-      <w:r>
-        <w:rPr>
-          <w:sz w:val="22"/>
-          <w:szCs w:val="22"/>
-          <w:lang w:val="es-ES_tradnl"/>
-        </w:rPr>
-        <w:t>se despliegan diferentes proyectos de diferentes categorías</w:t>
-      </w:r>
-      <w:r>
-        <w:rPr>
-          <w:sz w:val="22"/>
-          <w:szCs w:val="22"/>
-          <w:lang w:val="es-ES_tradnl"/>
-        </w:rPr>
-        <w:t xml:space="preserve"> (uno por cada categoría) </w:t>
-      </w:r>
-      <w:r>
-        <w:rPr>
-          <w:sz w:val="22"/>
-          <w:szCs w:val="22"/>
-          <w:lang w:val="es-ES_tradnl"/>
-        </w:rPr>
-        <w:t xml:space="preserve">por cada proyecto son diferentes fotografías, que no se cortan, salen al tamaño ordenadas de forma horizontal, </w:t>
-      </w:r>
-      <w:r>
-        <w:rPr>
-          <w:sz w:val="22"/>
-          <w:szCs w:val="22"/>
-          <w:lang w:val="es-ES_tradnl"/>
-        </w:rPr>
-        <w:t xml:space="preserve">las fotografías </w:t>
-      </w:r>
-      <w:r>
-        <w:rPr>
-          <w:sz w:val="22"/>
-          <w:szCs w:val="22"/>
-          <w:lang w:val="es-ES_tradnl"/>
-        </w:rPr>
-        <w:t>se deslizan horizontalmente</w:t>
-      </w:r>
-      <w:r>
-        <w:rPr>
-          <w:sz w:val="22"/>
-          <w:szCs w:val="22"/>
-          <w:lang w:val="es-ES_tradnl"/>
-        </w:rPr>
-        <w:t>. Cada</w:t>
-      </w:r>
-      <w:r>
-        <w:rPr>
-          <w:sz w:val="22"/>
-          <w:szCs w:val="22"/>
-          <w:lang w:val="es-ES_tradnl"/>
-        </w:rPr>
-        <w:t xml:space="preserve"> uno con tags diferentes y pequeños datos de información </w:t>
-      </w:r>
-      <w:r>
-        <w:rPr>
-          <w:sz w:val="22"/>
-          <w:szCs w:val="22"/>
-          <w:lang w:val="es-ES_tradnl"/>
-        </w:rPr>
-        <w:t>como el año al centro.</w:t>
-      </w:r>
-    </w:p>
-    <w:p>
-      <w:pPr>
-        <w:rPr>
-          <w:b/>
-          <w:bCs/>
-          <w:sz w:val="32"/>
-          <w:szCs w:val="32"/>
-          <w:lang w:val="es-ES_tradnl"/>
-        </w:rPr>
-      </w:pPr>
-    </w:p>
-    <w:p>
-      <w:pPr>
-        <w:rPr>
-          <w:b/>
-          <w:bCs/>
-          <w:sz w:val="32"/>
-          <w:szCs w:val="32"/>
-          <w:lang w:val="es-ES_tradnl"/>
-        </w:rPr>
-      </w:pPr>
-      <w:r>
-        <w:rPr>
-          <w:b/>
-          <w:bCs/>
-          <w:sz w:val="32"/>
-          <w:szCs w:val="32"/>
-          <w:lang w:val="es-ES_tradnl"/>
-        </w:rPr>
-        <w:t>5. Pie de página</w:t>
-      </w:r>
-    </w:p>
-    <w:p>
-      <w:pPr>
-        <w:rPr>
-          <w:sz w:val="22"/>
-          <w:szCs w:val="22"/>
-          <w:lang w:val="es-ES_tradnl"/>
-        </w:rPr>
-      </w:pPr>
-      <w:r>
-        <w:rPr>
-          <w:sz w:val="22"/>
-          <w:szCs w:val="22"/>
-        </w:rPr>
+          <w:rFonts w:ascii="Aptos" w:hAnsi="Aptos"/>
+          <w:sz w:val="22"/>
+          <w:szCs w:val="22"/>
+        </w:rPr>
+        <w:lastRenderedPageBreak/>
         <w:t>Un pie de página</w:t>
       </w:r>
       <w:r>
         <w:rPr>
-          <w:sz w:val="22"/>
-          <w:szCs w:val="22"/>
-        </w:rPr>
-        <w:t xml:space="preserve"> al final de </w:t>
-      </w:r>
-      <w:r>
-        <w:rPr>
-          <w:sz w:val="22"/>
-          <w:szCs w:val="22"/>
-        </w:rPr>
-        <w:t>las dos</w:t>
-      </w:r>
-      <w:r>
-        <w:rPr>
-          <w:sz w:val="22"/>
-          <w:szCs w:val="22"/>
-        </w:rPr>
-        <w:t xml:space="preserve"> página</w:t>
-      </w:r>
-      <w:r>
-        <w:rPr>
-          <w:sz w:val="22"/>
-          <w:szCs w:val="22"/>
-        </w:rPr>
-        <w:t xml:space="preserve">s de </w:t>
-      </w:r>
-      <w:r>
-        <w:rPr>
+          <w:rFonts w:ascii="Aptos" w:hAnsi="Aptos"/>
+          <w:sz w:val="22"/>
+          <w:szCs w:val="22"/>
+        </w:rPr>
+        <w:t xml:space="preserve"> al final</w:t>
+      </w:r>
+      <w:r>
+        <w:rPr>
+          <w:rFonts w:ascii="Aptos" w:hAnsi="Aptos"/>
           <w:sz w:val="22"/>
           <w:szCs w:val="22"/>
         </w:rPr>
@@ -1954,42 +2200,39 @@
       </w:r>
       <w:r>
         <w:rPr>
-          <w:sz w:val="22"/>
-          <w:szCs w:val="22"/>
-        </w:rPr>
-        <w:t xml:space="preserve">morado oscuro que presenta nuevamente mi </w:t>
-      </w:r>
-      <w:r>
-        <w:rPr>
-          <w:sz w:val="22"/>
-          <w:szCs w:val="22"/>
-        </w:rPr>
-        <w:t>logo</w:t>
-      </w:r>
-      <w:r>
-        <w:rPr>
-          <w:sz w:val="22"/>
-          <w:szCs w:val="22"/>
-        </w:rPr>
-        <w:t xml:space="preserve"> completo en su versión blanca, acompañado de la frase de cierre </w:t>
-      </w:r>
-      <w:r>
-        <w:rPr>
-          <w:sz w:val="22"/>
-          <w:szCs w:val="22"/>
-        </w:rPr>
-        <w:t xml:space="preserve">“Hasta aquí llega la </w:t>
-      </w:r>
-      <w:r>
-        <w:rPr>
-          <w:sz w:val="22"/>
-          <w:szCs w:val="22"/>
-        </w:rPr>
-        <w:lastRenderedPageBreak/>
-        <w:t>página, pero no las ideas”</w:t>
-      </w:r>
-      <w:r>
-        <w:rPr>
+          <w:rFonts w:ascii="Aptos" w:hAnsi="Aptos"/>
+          <w:sz w:val="22"/>
+          <w:szCs w:val="22"/>
+        </w:rPr>
+        <w:t>morado oscuro que presenta nuevamente mi logo completo en su versión blanca</w:t>
+      </w:r>
+      <w:r>
+        <w:rPr>
+          <w:rFonts w:ascii="Aptos" w:hAnsi="Aptos"/>
+          <w:sz w:val="22"/>
+          <w:szCs w:val="22"/>
+        </w:rPr>
+        <w:t xml:space="preserve"> que al darle clic lleva a Inicio</w:t>
+      </w:r>
+      <w:r>
+        <w:rPr>
+          <w:rFonts w:ascii="Aptos" w:hAnsi="Aptos"/>
+          <w:sz w:val="22"/>
+          <w:szCs w:val="22"/>
+        </w:rPr>
+        <w:t xml:space="preserve">, acompañado de la frase de cierre </w:t>
+      </w:r>
+      <w:r>
+        <w:rPr>
+          <w:rFonts w:ascii="Aptos" w:hAnsi="Aptos"/>
+          <w:sz w:val="22"/>
+          <w:szCs w:val="22"/>
+        </w:rPr>
+        <w:t>“Hasta aquí llega la página, pero no las ideas”</w:t>
+      </w:r>
+      <w:r>
+        <w:rPr>
+          <w:rFonts w:ascii="Aptos" w:hAnsi="Aptos"/>
           <w:sz w:val="22"/>
           <w:szCs w:val="22"/>
         </w:rPr>
@@ -2068,6 +2311,27 @@
 <file path=word/numbering.xml><?xml version="1.0" encoding="utf-8"?>
 <w:numbering xmlns:wpc="http://schemas.microsoft.com/office/word/2010/wordprocessingCanvas" xmlns:cx="http://schemas.microsoft.com/office/drawing/2014/chartex" xmlns:cx1="http://schemas.microsoft.com/office/drawing/2015/9/8/chartex" xmlns:cx2="http://schemas.microsoft.com/office/drawing/2015/10/21/chartex" xmlns:cx3="http://schemas.microsoft.com/office/drawing/2016/5/9/chartex" xmlns:cx4="http://schemas.microsoft.com/office/drawing/2016/5/10/chartex" xmlns:cx5="http://schemas.microsoft.com/office/drawing/2016/5/11/chartex" xmlns:cx6="http://schemas.microsoft.com/office/drawing/2016/5/12/chartex" xmlns:cx7="http://schemas.microsoft.com/office/drawing/2016/5/13/chartex" xmlns:cx8="http://schemas.microsoft.com/office/drawing/2016/5/14/chartex" xmlns:mc="http://schemas.openxmlformats.org/markup-compatibility/2006" xmlns:aink="http://schemas.microsoft.com/office/drawing/2016/ink" xmlns:am3d="http://schemas.microsoft.com/office/drawing/2017/model3d" xmlns:o="urn:schemas-microsoft-com:office:office" xmlns:oel="http://schemas.microsoft.com/office/2019/extlst" xmlns:r="http://schemas.openxmlformats.org/officeDocument/2006/relationships" xmlns:m="http://schemas.openxmlformats.org/officeDocument/2006/math" xmlns:v="urn:schemas-microsoft-com:vml" xmlns:wp14="http://schemas.microsoft.com/office/word/2010/wordprocessingDrawing" xmlns:wp="http://schemas.openxmlformats.org/drawingml/2006/wordprocessingDrawing" xmlns:w10="urn:schemas-microsoft-com:office:word" xmlns:w="http://schemas.openxmlformats.org/wordprocessingml/2006/main" xmlns:w14="http://schemas.microsoft.com/office/word/2010/wordml" xmlns:w15="http://schemas.microsoft.com/office/word/2012/wordml" xmlns:w16cex="http://schemas.microsoft.com/office/word/2018/wordml/cex" xmlns:w16cid="http://schemas.microsoft.com/office/word/2016/wordml/cid" xmlns:w16="http://schemas.microsoft.com/office/word/2018/wordml" xmlns:w16du="http://schemas.microsoft.com/office/word/2023/wordml/word16du" xmlns:w16sdtdh="http://schemas.microsoft.com/office/word/2020/wordml/sdtdatahash" xmlns:w16se="http://schemas.microsoft.com/office/word/2015/wordml/symex" xmlns:wpg="http://schemas.microsoft.com/office/word/2010/wordprocessingGroup" xmlns:wpi="http://schemas.microsoft.com/office/word/2010/wordprocessingInk" xmlns:wne="http://schemas.microsoft.com/office/word/2006/wordml" xmlns:wps="http://schemas.microsoft.com/office/word/2010/wordprocessingShape" mc:Ignorable="w14 w15 w16se w16cid w16 w16cex w16sdtdh w16du wp14">
   <w:abstractNum w:abstractNumId="0" w15:restartNumberingAfterBreak="0">
+    <w:nsid w:val="FFFFFF89"/>
+    <w:multiLevelType w:val="singleLevel"/>
+    <w:tmpl w:val="20129C3C"/>
+    <w:lvl w:ilvl="0">
+      <w:start w:val="1"/>
+      <w:numFmt w:val="bullet"/>
+      <w:pStyle w:val="Listaconvietas"/>
+      <w:lvlText w:val=""/>
+      <w:lvlJc w:val="left"/>
+      <w:pPr>
+        <w:tabs>
+          <w:tab w:val="num" w:pos="540"/>
+        </w:tabs>
+        <w:ind w:left="540" w:hanging="270"/>
+      </w:pPr>
+      <w:rPr>
+        <w:rFonts w:ascii="Symbol" w:hAnsi="Symbol" w:hint="default"/>
+      </w:rPr>
+    </w:lvl>
+  </w:abstractNum>
+  <w:abstractNum w:abstractNumId="1" w15:restartNumberingAfterBreak="0">
     <w:nsid w:val="2401699D"/>
     <w:multiLevelType w:val="hybridMultilevel"/>
     <w:tmpl w:val="1E7250C8"/>
@@ -2156,7 +2420,7 @@
       </w:pPr>
     </w:lvl>
   </w:abstractNum>
-  <w:abstractNum w:abstractNumId="1" w15:restartNumberingAfterBreak="0">
+  <w:abstractNum w:abstractNumId="2" w15:restartNumberingAfterBreak="0">
     <w:nsid w:val="36424B54"/>
     <w:multiLevelType w:val="hybridMultilevel"/>
     <w:tmpl w:val="1A46671E"/>
@@ -2210,7 +2474,7 @@
       <w:lvlJc w:val="left"/>
     </w:lvl>
   </w:abstractNum>
-  <w:abstractNum w:abstractNumId="2" w15:restartNumberingAfterBreak="0">
+  <w:abstractNum w:abstractNumId="3" w15:restartNumberingAfterBreak="0">
     <w:nsid w:val="476241CA"/>
     <w:multiLevelType w:val="hybridMultilevel"/>
     <w:tmpl w:val="1E7250C8"/>
@@ -2299,7 +2563,120 @@
       </w:pPr>
     </w:lvl>
   </w:abstractNum>
-  <w:abstractNum w:abstractNumId="3" w15:restartNumberingAfterBreak="0">
+  <w:abstractNum w:abstractNumId="4" w15:restartNumberingAfterBreak="0">
+    <w:nsid w:val="51AE59C9"/>
+    <w:multiLevelType w:val="hybridMultilevel"/>
+    <w:tmpl w:val="63B8F128"/>
+    <w:lvl w:ilvl="0" w:tplc="080A0001">
+      <w:start w:val="1"/>
+      <w:numFmt w:val="bullet"/>
+      <w:lvlText w:val=""/>
+      <w:lvlJc w:val="left"/>
+      <w:pPr>
+        <w:ind w:left="720" w:hanging="360"/>
+      </w:pPr>
+      <w:rPr>
+        <w:rFonts w:ascii="Symbol" w:hAnsi="Symbol" w:hint="default"/>
+      </w:rPr>
+    </w:lvl>
+    <w:lvl w:ilvl="1" w:tplc="080A0003" w:tentative="1">
+      <w:start w:val="1"/>
+      <w:numFmt w:val="bullet"/>
+      <w:lvlText w:val="o"/>
+      <w:lvlJc w:val="left"/>
+      <w:pPr>
+        <w:ind w:left="1440" w:hanging="360"/>
+      </w:pPr>
+      <w:rPr>
+        <w:rFonts w:ascii="Courier New" w:hAnsi="Courier New" w:cs="Courier New" w:hint="default"/>
+      </w:rPr>
+    </w:lvl>
+    <w:lvl w:ilvl="2" w:tplc="080A0005" w:tentative="1">
+      <w:start w:val="1"/>
+      <w:numFmt w:val="bullet"/>
+      <w:lvlText w:val=""/>
+      <w:lvlJc w:val="left"/>
+      <w:pPr>
+        <w:ind w:left="2160" w:hanging="360"/>
+      </w:pPr>
+      <w:rPr>
+        <w:rFonts w:ascii="Wingdings" w:hAnsi="Wingdings" w:hint="default"/>
+      </w:rPr>
+    </w:lvl>
+    <w:lvl w:ilvl="3" w:tplc="080A0001" w:tentative="1">
+      <w:start w:val="1"/>
+      <w:numFmt w:val="bullet"/>
+      <w:lvlText w:val=""/>
+      <w:lvlJc w:val="left"/>
+      <w:pPr>
+        <w:ind w:left="2880" w:hanging="360"/>
+      </w:pPr>
+      <w:rPr>
+        <w:rFonts w:ascii="Symbol" w:hAnsi="Symbol" w:hint="default"/>
+      </w:rPr>
+    </w:lvl>
+    <w:lvl w:ilvl="4" w:tplc="080A0003" w:tentative="1">
+      <w:start w:val="1"/>
+      <w:numFmt w:val="bullet"/>
+      <w:lvlText w:val="o"/>
+      <w:lvlJc w:val="left"/>
+      <w:pPr>
+        <w:ind w:left="3600" w:hanging="360"/>
+      </w:pPr>
+      <w:rPr>
+        <w:rFonts w:ascii="Courier New" w:hAnsi="Courier New" w:cs="Courier New" w:hint="default"/>
+      </w:rPr>
+    </w:lvl>
+    <w:lvl w:ilvl="5" w:tplc="080A0005" w:tentative="1">
+      <w:start w:val="1"/>
+      <w:numFmt w:val="bullet"/>
+      <w:lvlText w:val=""/>
+      <w:lvlJc w:val="left"/>
+      <w:pPr>
+        <w:ind w:left="4320" w:hanging="360"/>
+      </w:pPr>
+      <w:rPr>
+        <w:rFonts w:ascii="Wingdings" w:hAnsi="Wingdings" w:hint="default"/>
+      </w:rPr>
+    </w:lvl>
+    <w:lvl w:ilvl="6" w:tplc="080A0001" w:tentative="1">
+      <w:start w:val="1"/>
+      <w:numFmt w:val="bullet"/>
+      <w:lvlText w:val=""/>
+      <w:lvlJc w:val="left"/>
+      <w:pPr>
+        <w:ind w:left="5040" w:hanging="360"/>
+      </w:pPr>
+      <w:rPr>
+        <w:rFonts w:ascii="Symbol" w:hAnsi="Symbol" w:hint="default"/>
+      </w:rPr>
+    </w:lvl>
+    <w:lvl w:ilvl="7" w:tplc="080A0003" w:tentative="1">
+      <w:start w:val="1"/>
+      <w:numFmt w:val="bullet"/>
+      <w:lvlText w:val="o"/>
+      <w:lvlJc w:val="left"/>
+      <w:pPr>
+        <w:ind w:left="5760" w:hanging="360"/>
+      </w:pPr>
+      <w:rPr>
+        <w:rFonts w:ascii="Courier New" w:hAnsi="Courier New" w:cs="Courier New" w:hint="default"/>
+      </w:rPr>
+    </w:lvl>
+    <w:lvl w:ilvl="8" w:tplc="080A0005" w:tentative="1">
+      <w:start w:val="1"/>
+      <w:numFmt w:val="bullet"/>
+      <w:lvlText w:val=""/>
+      <w:lvlJc w:val="left"/>
+      <w:pPr>
+        <w:ind w:left="6480" w:hanging="360"/>
+      </w:pPr>
+      <w:rPr>
+        <w:rFonts w:ascii="Wingdings" w:hAnsi="Wingdings" w:hint="default"/>
+      </w:rPr>
+    </w:lvl>
+  </w:abstractNum>
+  <w:abstractNum w:abstractNumId="5" w15:restartNumberingAfterBreak="0">
     <w:nsid w:val="5C8D505C"/>
     <w:multiLevelType w:val="hybridMultilevel"/>
     <w:tmpl w:val="23086E0A"/>
@@ -2412,7 +2789,7 @@
       </w:rPr>
     </w:lvl>
   </w:abstractNum>
-  <w:abstractNum w:abstractNumId="4" w15:restartNumberingAfterBreak="0">
+  <w:abstractNum w:abstractNumId="6" w15:restartNumberingAfterBreak="0">
     <w:nsid w:val="7A8640D8"/>
     <w:multiLevelType w:val="hybridMultilevel"/>
     <w:tmpl w:val="1E7250C8"/>
@@ -2502,22 +2879,28 @@
     </w:lvl>
   </w:abstractNum>
   <w:num w:numId="1" w16cid:durableId="1130826225">
-    <w:abstractNumId w:val="2"/>
+    <w:abstractNumId w:val="3"/>
   </w:num>
   <w:num w:numId="2" w16cid:durableId="1920209695">
-    <w:abstractNumId w:val="4"/>
+    <w:abstractNumId w:val="6"/>
   </w:num>
   <w:num w:numId="3" w16cid:durableId="135340083">
-    <w:abstractNumId w:val="0"/>
+    <w:abstractNumId w:val="1"/>
   </w:num>
   <w:num w:numId="4" w16cid:durableId="1322779823">
-    <w:abstractNumId w:val="3"/>
+    <w:abstractNumId w:val="5"/>
   </w:num>
   <w:num w:numId="5" w16cid:durableId="156000961">
-    <w:abstractNumId w:val="1"/>
+    <w:abstractNumId w:val="2"/>
     <w:lvlOverride w:ilvl="0">
       <w:startOverride w:val="1"/>
     </w:lvlOverride>
+  </w:num>
+  <w:num w:numId="6" w16cid:durableId="1535076877">
+    <w:abstractNumId w:val="0"/>
+  </w:num>
+  <w:num w:numId="7" w16cid:durableId="1889680673">
+    <w:abstractNumId w:val="4"/>
   </w:num>
 </w:numbering>
 </file>
@@ -2973,7 +3356,6 @@
     <w:next w:val="Normal"/>
     <w:link w:val="Ttulo3Car"/>
     <w:uiPriority w:val="9"/>
-    <w:semiHidden/>
     <w:unhideWhenUsed/>
     <w:qFormat/>
     <w:rsid w:val="00F27A9D"/>
@@ -3180,7 +3562,6 @@
     <w:basedOn w:val="Fuentedeprrafopredeter"/>
     <w:link w:val="Ttulo3"/>
     <w:uiPriority w:val="9"/>
-    <w:semiHidden/>
     <w:rsid w:val="00F27A9D"/>
     <w:rPr>
       <w:rFonts w:eastAsiaTheme="majorEastAsia" w:cstheme="majorBidi"/>
@@ -3516,6 +3897,30 @@
       <w:u w:val="single"/>
     </w:rPr>
   </w:style>
+  <w:style w:type="paragraph" w:styleId="Listaconvietas">
+    <w:name w:val="List Bullet"/>
+    <w:basedOn w:val="Normal"/>
+    <w:uiPriority w:val="99"/>
+    <w:unhideWhenUsed/>
+    <w:rsid w:val="00215A26"/>
+    <w:pPr>
+      <w:numPr>
+        <w:numId w:val="6"/>
+      </w:numPr>
+      <w:spacing w:after="80" w:line="300" w:lineRule="auto"/>
+      <w:ind w:hanging="271"/>
+      <w:contextualSpacing/>
+    </w:pPr>
+    <w:rPr>
+      <w:rFonts w:ascii="Calibri" w:eastAsiaTheme="minorEastAsia" w:hAnsi="Calibri"/>
+      <w:color w:val="202225"/>
+      <w:kern w:val="0"/>
+      <w:sz w:val="22"/>
+      <w:szCs w:val="22"/>
+      <w:lang w:val="en-US"/>
+      <w14:ligatures w14:val="none"/>
+    </w:rPr>
+  </w:style>
 </w:styles>
 </file>
 

</xml_diff>

<commit_message>
Design.html alineado al index: trazo de flores en demo, tilt del ícono, favicon y menú fijo idéntico
- Demo de cursor: estela de flores cada ~90px con fade y texto actualizado
- Tilt (-6deg) del isotipo del header
- Favicon con el isotipo de la marca
- Menú móvil con toggle de iconos hamburguesa/X y panel desplegable unificado
</commit_message>
<xml_diff>
--- a/ARQUITECTURA-CV.docx
+++ b/ARQUITECTURA-CV.docx
@@ -94,222 +94,329 @@
           <w:sz w:val="22"/>
           <w:szCs w:val="22"/>
         </w:rPr>
-        <w:t>Documento complementario a DESIGN.md · El contenido define qué va y en qué orden; DESIGN.md gobierna cómo se ve.</w:t>
-      </w:r>
-    </w:p>
-    <w:p>
-      <w:pPr>
-        <w:rPr>
-          <w:rFonts w:ascii="Aptos" w:eastAsia="Calibri" w:hAnsi="Aptos"/>
-          <w:color w:val="202225"/>
-          <w:sz w:val="22"/>
-          <w:szCs w:val="22"/>
-        </w:rPr>
-      </w:pPr>
-      <w:r>
-        <w:rPr>
-          <w:rFonts w:ascii="Aptos" w:eastAsia="Calibri" w:hAnsi="Aptos"/>
-          <w:color w:val="202225"/>
-          <w:sz w:val="22"/>
-          <w:szCs w:val="22"/>
-        </w:rPr>
-        <w:t>Este documento define la arquitectura de información, el contenido, el orden, los enlaces y el comportamiento funcional. Los colores, tipografías, dimensiones, sombras, formas y demás decisiones visuales se toman únicamente de DESIGN.md.</w:t>
-      </w:r>
-      <w:r>
-        <w:rPr>
-          <w:rFonts w:ascii="Aptos" w:eastAsia="Calibri" w:hAnsi="Aptos"/>
-          <w:color w:val="202225"/>
+        <w:t xml:space="preserve">Documento complementario a </w:t>
+      </w:r>
+      <w:r>
+        <w:rPr>
+          <w:rFonts w:ascii="Aptos" w:eastAsia="Calibri" w:hAnsi="Aptos"/>
+          <w:i/>
+          <w:color w:val="424A93"/>
+          <w:sz w:val="22"/>
+          <w:szCs w:val="22"/>
+        </w:rPr>
+        <w:t>DESIGN</w:t>
+      </w:r>
+      <w:r>
+        <w:rPr>
+          <w:rFonts w:ascii="Aptos" w:eastAsia="Calibri" w:hAnsi="Aptos"/>
+          <w:i/>
+          <w:color w:val="424A93"/>
+          <w:sz w:val="22"/>
+          <w:szCs w:val="22"/>
+        </w:rPr>
+        <w:t>.md · El contenido define qué va y en qué orden; DESIGN.md gobierna cómo se ve.</w:t>
+      </w:r>
+    </w:p>
+    <w:p>
+      <w:pPr>
+        <w:rPr>
+          <w:rFonts w:ascii="Aptos" w:eastAsia="Calibri" w:hAnsi="Aptos"/>
+          <w:color w:val="202225"/>
+          <w:sz w:val="22"/>
+          <w:szCs w:val="22"/>
+        </w:rPr>
+      </w:pPr>
+      <w:r>
+        <w:rPr>
+          <w:rFonts w:ascii="Aptos" w:eastAsia="Calibri" w:hAnsi="Aptos"/>
+          <w:color w:val="202225"/>
+          <w:sz w:val="22"/>
+          <w:szCs w:val="22"/>
+        </w:rPr>
+        <w:t xml:space="preserve">Este documento define la arquitectura de información, el contenido, el orden, los enlaces y el comportamiento funcional. Los colores, tipografías, dimensiones, sombras, formas y demás decisiones visuales se toman únicamente de DESIGN.md. </w:t>
+      </w:r>
+    </w:p>
+    <w:p>
+      <w:pPr>
+        <w:pStyle w:val="Listaconvietas"/>
+        <w:rPr>
+          <w:rFonts w:ascii="Aptos" w:hAnsi="Aptos"/>
+          <w:lang w:val="es-MX"/>
+        </w:rPr>
+      </w:pPr>
+      <w:r>
+        <w:rPr>
+          <w:rFonts w:ascii="Aptos" w:eastAsia="Calibri" w:hAnsi="Aptos"/>
+          <w:b/>
+          <w:lang w:val="es-MX"/>
+        </w:rPr>
+        <w:t>Salida esperada:</w:t>
+      </w:r>
+      <w:r>
+        <w:rPr>
+          <w:rFonts w:ascii="Aptos" w:eastAsia="Calibri" w:hAnsi="Aptos"/>
+          <w:lang w:val="es-MX"/>
+        </w:rPr>
+        <w:t xml:space="preserve"> un archivo CV.md y una sola landing responsiva en un único HTML.</w:t>
+      </w:r>
+    </w:p>
+    <w:p>
+      <w:pPr>
+        <w:pStyle w:val="Listaconvietas"/>
+        <w:rPr>
+          <w:rFonts w:ascii="Aptos" w:hAnsi="Aptos"/>
+          <w:lang w:val="es-MX"/>
+        </w:rPr>
+      </w:pPr>
+      <w:r>
+        <w:rPr>
+          <w:rFonts w:ascii="Aptos" w:eastAsia="Calibri" w:hAnsi="Aptos"/>
+          <w:b/>
+          <w:lang w:val="es-MX"/>
+        </w:rPr>
+        <w:t>No crear:</w:t>
+      </w:r>
+      <w:r>
+        <w:rPr>
+          <w:rFonts w:ascii="Aptos" w:eastAsia="Calibri" w:hAnsi="Aptos"/>
+          <w:lang w:val="es-MX"/>
+        </w:rPr>
+        <w:t xml:space="preserve"> una página adicional de Proyectos, páginas separadas por proyecto ni un preloader entre secciones.</w:t>
+      </w:r>
+    </w:p>
+    <w:p>
+      <w:pPr>
+        <w:spacing w:after="60"/>
+        <w:rPr>
+          <w:rFonts w:ascii="Aptos" w:hAnsi="Aptos"/>
+          <w:sz w:val="22"/>
+          <w:szCs w:val="22"/>
+        </w:rPr>
+      </w:pPr>
+    </w:p>
+    <w:p>
+      <w:pPr>
+        <w:rPr>
+          <w:rFonts w:ascii="Aptos" w:hAnsi="Aptos"/>
+          <w:b/>
+          <w:bCs/>
+          <w:sz w:val="22"/>
+          <w:szCs w:val="22"/>
+          <w:lang w:val="es-ES_tradnl"/>
+        </w:rPr>
+      </w:pPr>
+      <w:r>
+        <w:rPr>
+          <w:rFonts w:ascii="Aptos" w:hAnsi="Aptos"/>
+          <w:b/>
+          <w:bCs/>
+          <w:sz w:val="22"/>
+          <w:szCs w:val="22"/>
+          <w:lang w:val="es-ES_tradnl"/>
+        </w:rPr>
+        <w:t xml:space="preserve">1. </w:t>
+      </w:r>
+      <w:r>
+        <w:rPr>
+          <w:rFonts w:ascii="Aptos" w:hAnsi="Aptos"/>
+          <w:b/>
+          <w:bCs/>
+          <w:sz w:val="22"/>
+          <w:szCs w:val="22"/>
+          <w:lang w:val="es-ES_tradnl"/>
+        </w:rPr>
+        <w:t>Estructura general y navegación</w:t>
+      </w:r>
+    </w:p>
+    <w:p>
+      <w:pPr>
+        <w:rPr>
+          <w:rFonts w:ascii="Aptos" w:hAnsi="Aptos"/>
+          <w:sz w:val="22"/>
+          <w:szCs w:val="22"/>
+        </w:rPr>
+      </w:pPr>
+      <w:r>
+        <w:rPr>
+          <w:rFonts w:ascii="Aptos" w:hAnsi="Aptos"/>
+          <w:sz w:val="22"/>
+          <w:szCs w:val="22"/>
+          <w:lang w:val="es-ES_tradnl"/>
+        </w:rPr>
+        <w:t xml:space="preserve">Mi CV es una </w:t>
+      </w:r>
+      <w:r>
+        <w:rPr>
+          <w:rFonts w:ascii="Aptos" w:hAnsi="Aptos"/>
+          <w:sz w:val="22"/>
+          <w:szCs w:val="22"/>
+          <w:lang w:val="es-ES_tradnl"/>
+        </w:rPr>
+        <w:t>de una sola página (</w:t>
+      </w:r>
+      <w:proofErr w:type="spellStart"/>
+      <w:r>
+        <w:rPr>
+          <w:rFonts w:ascii="Aptos" w:hAnsi="Aptos"/>
+          <w:sz w:val="22"/>
+          <w:szCs w:val="22"/>
+          <w:lang w:val="es-ES_tradnl"/>
+        </w:rPr>
+        <w:t>one</w:t>
+      </w:r>
+      <w:proofErr w:type="spellEnd"/>
+      <w:r>
+        <w:rPr>
+          <w:rFonts w:ascii="Aptos" w:hAnsi="Aptos"/>
+          <w:sz w:val="22"/>
+          <w:szCs w:val="22"/>
+          <w:lang w:val="es-ES_tradnl"/>
+        </w:rPr>
+        <w:t>-page)</w:t>
+      </w:r>
+      <w:r>
+        <w:rPr>
+          <w:rFonts w:ascii="Aptos" w:hAnsi="Aptos"/>
+          <w:sz w:val="22"/>
+          <w:szCs w:val="22"/>
+        </w:rPr>
+        <w:t xml:space="preserve">. </w:t>
+      </w:r>
+      <w:r>
+        <w:rPr>
+          <w:rFonts w:ascii="Aptos" w:hAnsi="Aptos"/>
+          <w:sz w:val="22"/>
+          <w:szCs w:val="22"/>
+        </w:rPr>
+        <w:t>El preloader aparece únicamente durante la carga inicial. El ícono de marca se desplaza hacia arriba y descubre la landing y se queda como en el menú fijo con el</w:t>
+      </w:r>
+      <w:r>
+        <w:rPr>
+          <w:rFonts w:ascii="Aptos" w:hAnsi="Aptos"/>
+          <w:sz w:val="22"/>
+          <w:szCs w:val="22"/>
+        </w:rPr>
+        <w:t xml:space="preserve"> mismo</w:t>
+      </w:r>
+      <w:r>
+        <w:rPr>
+          <w:rFonts w:ascii="Aptos" w:hAnsi="Aptos"/>
+          <w:sz w:val="22"/>
+          <w:szCs w:val="22"/>
+        </w:rPr>
+        <w:t xml:space="preserve"> ícono de mi marca</w:t>
+      </w:r>
+      <w:r>
+        <w:rPr>
+          <w:rFonts w:ascii="Aptos" w:hAnsi="Aptos"/>
+          <w:sz w:val="22"/>
+          <w:szCs w:val="22"/>
+        </w:rPr>
+        <w:t xml:space="preserve"> al centro</w:t>
+      </w:r>
+      <w:r>
+        <w:rPr>
+          <w:rFonts w:ascii="Aptos" w:hAnsi="Aptos"/>
+          <w:sz w:val="22"/>
+          <w:szCs w:val="22"/>
+        </w:rPr>
+        <w:t>; no vuelve a mostrarse al navegar entre secciones.</w:t>
+      </w:r>
+      <w:r>
+        <w:rPr>
+          <w:rFonts w:ascii="Aptos" w:hAnsi="Aptos"/>
+          <w:sz w:val="22"/>
+          <w:szCs w:val="22"/>
+        </w:rPr>
+        <w:t xml:space="preserve"> El menú permanece fijo en la parte superior. El ícono de marca lleva a Inicio y los enlaces llevan a </w:t>
+      </w:r>
+      <w:r>
+        <w:rPr>
+          <w:rFonts w:ascii="Aptos" w:hAnsi="Aptos"/>
+          <w:sz w:val="22"/>
+          <w:szCs w:val="22"/>
+        </w:rPr>
+        <w:t>S</w:t>
+      </w:r>
+      <w:r>
+        <w:rPr>
+          <w:rFonts w:ascii="Aptos" w:hAnsi="Aptos"/>
+          <w:sz w:val="22"/>
+          <w:szCs w:val="22"/>
+        </w:rPr>
+        <w:t>obre</w:t>
+      </w:r>
+      <w:r>
+        <w:rPr>
+          <w:rFonts w:ascii="Aptos" w:hAnsi="Aptos"/>
           <w:sz w:val="22"/>
           <w:szCs w:val="22"/>
         </w:rPr>
         <w:t xml:space="preserve"> </w:t>
       </w:r>
-    </w:p>
-    <w:p>
-      <w:pPr>
-        <w:pStyle w:val="Listaconvietas"/>
-        <w:rPr>
-          <w:rFonts w:ascii="Aptos" w:hAnsi="Aptos"/>
-          <w:lang w:val="es-MX"/>
-        </w:rPr>
-      </w:pPr>
-      <w:r>
-        <w:rPr>
-          <w:rFonts w:ascii="Aptos" w:eastAsia="Calibri" w:hAnsi="Aptos"/>
-          <w:b/>
-          <w:lang w:val="es-MX"/>
-        </w:rPr>
-        <w:t>Salida esperada:</w:t>
-      </w:r>
-      <w:r>
-        <w:rPr>
-          <w:rFonts w:ascii="Aptos" w:eastAsia="Calibri" w:hAnsi="Aptos"/>
-          <w:lang w:val="es-MX"/>
-        </w:rPr>
-        <w:t xml:space="preserve"> un archivo CV.md y una sola landing responsiva en un único HTML.</w:t>
-      </w:r>
-    </w:p>
-    <w:p>
-      <w:pPr>
-        <w:pStyle w:val="Listaconvietas"/>
-        <w:rPr>
-          <w:rFonts w:ascii="Aptos" w:hAnsi="Aptos"/>
-          <w:lang w:val="es-MX"/>
-        </w:rPr>
-      </w:pPr>
-      <w:r>
-        <w:rPr>
-          <w:rFonts w:ascii="Aptos" w:eastAsia="Calibri" w:hAnsi="Aptos"/>
-          <w:b/>
-          <w:lang w:val="es-MX"/>
-        </w:rPr>
-        <w:t>No crear:</w:t>
-      </w:r>
-      <w:r>
-        <w:rPr>
-          <w:rFonts w:ascii="Aptos" w:eastAsia="Calibri" w:hAnsi="Aptos"/>
-          <w:lang w:val="es-MX"/>
-        </w:rPr>
-        <w:t xml:space="preserve"> una página adicional de Proyectos, páginas separadas por proyecto ni un preloader entre secciones.</w:t>
-      </w:r>
-    </w:p>
-    <w:p>
-      <w:pPr>
-        <w:spacing w:after="60"/>
-        <w:rPr>
-          <w:rFonts w:ascii="Aptos" w:hAnsi="Aptos"/>
-          <w:sz w:val="22"/>
-          <w:szCs w:val="22"/>
-        </w:rPr>
-      </w:pPr>
-    </w:p>
-    <w:p>
-      <w:pPr>
-        <w:rPr>
-          <w:rFonts w:ascii="Aptos" w:hAnsi="Aptos"/>
-          <w:b/>
-          <w:bCs/>
-          <w:sz w:val="22"/>
-          <w:szCs w:val="22"/>
-          <w:lang w:val="es-ES_tradnl"/>
-        </w:rPr>
-      </w:pPr>
-      <w:r>
-        <w:rPr>
-          <w:rFonts w:ascii="Aptos" w:hAnsi="Aptos"/>
-          <w:b/>
-          <w:bCs/>
-          <w:sz w:val="22"/>
-          <w:szCs w:val="22"/>
-          <w:lang w:val="es-ES_tradnl"/>
-        </w:rPr>
-        <w:t xml:space="preserve">1. </w:t>
-      </w:r>
-      <w:r>
-        <w:rPr>
-          <w:rFonts w:ascii="Aptos" w:hAnsi="Aptos"/>
-          <w:b/>
-          <w:bCs/>
-          <w:sz w:val="22"/>
-          <w:szCs w:val="22"/>
-          <w:lang w:val="es-ES_tradnl"/>
-        </w:rPr>
-        <w:t>Estructura general y navegación</w:t>
-      </w:r>
-    </w:p>
-    <w:p>
-      <w:pPr>
-        <w:rPr>
-          <w:rFonts w:ascii="Aptos" w:hAnsi="Aptos"/>
-          <w:sz w:val="22"/>
-          <w:szCs w:val="22"/>
-        </w:rPr>
-      </w:pPr>
-      <w:r>
-        <w:rPr>
-          <w:rFonts w:ascii="Aptos" w:hAnsi="Aptos"/>
-          <w:sz w:val="22"/>
-          <w:szCs w:val="22"/>
-          <w:lang w:val="es-ES_tradnl"/>
-        </w:rPr>
-        <w:t xml:space="preserve">Mi CV es una </w:t>
-      </w:r>
-      <w:r>
-        <w:rPr>
-          <w:rFonts w:ascii="Aptos" w:hAnsi="Aptos"/>
-          <w:sz w:val="22"/>
-          <w:szCs w:val="22"/>
-          <w:lang w:val="es-ES_tradnl"/>
-        </w:rPr>
-        <w:t>de una sola página (</w:t>
-      </w:r>
-      <w:proofErr w:type="spellStart"/>
-      <w:r>
-        <w:rPr>
-          <w:rFonts w:ascii="Aptos" w:hAnsi="Aptos"/>
-          <w:sz w:val="22"/>
-          <w:szCs w:val="22"/>
-          <w:lang w:val="es-ES_tradnl"/>
-        </w:rPr>
-        <w:t>one</w:t>
-      </w:r>
-      <w:proofErr w:type="spellEnd"/>
-      <w:r>
-        <w:rPr>
-          <w:rFonts w:ascii="Aptos" w:hAnsi="Aptos"/>
-          <w:sz w:val="22"/>
-          <w:szCs w:val="22"/>
-          <w:lang w:val="es-ES_tradnl"/>
-        </w:rPr>
-        <w:t>-page)</w:t>
-      </w:r>
-      <w:r>
-        <w:rPr>
-          <w:rFonts w:ascii="Aptos" w:hAnsi="Aptos"/>
-          <w:sz w:val="22"/>
-          <w:szCs w:val="22"/>
-        </w:rPr>
-        <w:t xml:space="preserve">. </w:t>
-      </w:r>
-      <w:r>
-        <w:rPr>
-          <w:rFonts w:ascii="Aptos" w:hAnsi="Aptos"/>
-          <w:sz w:val="22"/>
-          <w:szCs w:val="22"/>
-        </w:rPr>
-        <w:t>El preloader aparece únicamente durante la carga inicial. El ícono de marca se desplaza hacia arriba y descubre la landing y se queda como en el menú fijo con el</w:t>
-      </w:r>
-      <w:r>
-        <w:rPr>
-          <w:rFonts w:ascii="Aptos" w:hAnsi="Aptos"/>
-          <w:sz w:val="22"/>
-          <w:szCs w:val="22"/>
-        </w:rPr>
-        <w:t xml:space="preserve"> mismo</w:t>
-      </w:r>
-      <w:r>
-        <w:rPr>
-          <w:rFonts w:ascii="Aptos" w:hAnsi="Aptos"/>
-          <w:sz w:val="22"/>
-          <w:szCs w:val="22"/>
-        </w:rPr>
-        <w:t xml:space="preserve"> ícono de mi marca</w:t>
-      </w:r>
-      <w:r>
-        <w:rPr>
-          <w:rFonts w:ascii="Aptos" w:hAnsi="Aptos"/>
-          <w:sz w:val="22"/>
-          <w:szCs w:val="22"/>
-        </w:rPr>
-        <w:t xml:space="preserve"> al centro</w:t>
-      </w:r>
-      <w:r>
-        <w:rPr>
-          <w:rFonts w:ascii="Aptos" w:hAnsi="Aptos"/>
-          <w:sz w:val="22"/>
-          <w:szCs w:val="22"/>
-        </w:rPr>
-        <w:t>; no vuelve a mostrarse al navegar entre secciones.</w:t>
+      <w:r>
+        <w:rPr>
+          <w:rFonts w:ascii="Aptos" w:hAnsi="Aptos"/>
+          <w:sz w:val="22"/>
+          <w:szCs w:val="22"/>
+        </w:rPr>
+        <w:t>m</w:t>
+      </w:r>
+      <w:r>
+        <w:rPr>
+          <w:rFonts w:ascii="Aptos" w:hAnsi="Aptos"/>
+          <w:sz w:val="22"/>
+          <w:szCs w:val="22"/>
+        </w:rPr>
+        <w:t>í</w:t>
+      </w:r>
+      <w:r>
+        <w:rPr>
+          <w:rFonts w:ascii="Aptos" w:hAnsi="Aptos"/>
+          <w:sz w:val="22"/>
+          <w:szCs w:val="22"/>
+        </w:rPr>
+        <w:t>,</w:t>
+      </w:r>
+      <w:r>
+        <w:rPr>
+          <w:rFonts w:ascii="Aptos" w:hAnsi="Aptos"/>
+          <w:sz w:val="22"/>
+          <w:szCs w:val="22"/>
+        </w:rPr>
+        <w:t xml:space="preserve"> Mis p</w:t>
+      </w:r>
+      <w:r>
+        <w:rPr>
+          <w:rFonts w:ascii="Aptos" w:hAnsi="Aptos"/>
+          <w:sz w:val="22"/>
+          <w:szCs w:val="22"/>
+        </w:rPr>
+        <w:t xml:space="preserve">royectos y </w:t>
+      </w:r>
+      <w:r>
+        <w:rPr>
+          <w:rFonts w:ascii="Aptos" w:hAnsi="Aptos"/>
+          <w:sz w:val="22"/>
+          <w:szCs w:val="22"/>
+        </w:rPr>
+        <w:t>C</w:t>
+      </w:r>
+      <w:r>
+        <w:rPr>
+          <w:rFonts w:ascii="Aptos" w:hAnsi="Aptos"/>
+          <w:sz w:val="22"/>
+          <w:szCs w:val="22"/>
+        </w:rPr>
+        <w:t>ontacto.</w:t>
+      </w:r>
+      <w:r>
+        <w:rPr>
+          <w:rFonts w:ascii="Aptos" w:hAnsi="Aptos"/>
+          <w:sz w:val="22"/>
+          <w:szCs w:val="22"/>
+        </w:rPr>
+        <w:t xml:space="preserve"> Todos los enlaces internos realizan un desplazamiento suave dentro del mismo HTML.</w:t>
       </w:r>
       <w:r>
         <w:rPr>
@@ -319,134 +426,6 @@
         </w:rPr>
         <w:t xml:space="preserve"> </w:t>
       </w:r>
-      <w:r>
-        <w:rPr>
-          <w:rFonts w:ascii="Aptos" w:hAnsi="Aptos"/>
-          <w:sz w:val="22"/>
-          <w:szCs w:val="22"/>
-        </w:rPr>
-        <w:t xml:space="preserve">El menú permanece fijo en la parte superior. El ícono de marca lleva a </w:t>
-      </w:r>
-      <w:r>
-        <w:rPr>
-          <w:rFonts w:ascii="Aptos" w:hAnsi="Aptos"/>
-          <w:sz w:val="22"/>
-          <w:szCs w:val="22"/>
-        </w:rPr>
-        <w:t>I</w:t>
-      </w:r>
-      <w:r>
-        <w:rPr>
-          <w:rFonts w:ascii="Aptos" w:hAnsi="Aptos"/>
-          <w:sz w:val="22"/>
-          <w:szCs w:val="22"/>
-        </w:rPr>
-        <w:t xml:space="preserve">nicio y los enlaces llevan a </w:t>
-      </w:r>
-      <w:r>
-        <w:rPr>
-          <w:rFonts w:ascii="Aptos" w:hAnsi="Aptos"/>
-          <w:sz w:val="22"/>
-          <w:szCs w:val="22"/>
-        </w:rPr>
-        <w:t>S</w:t>
-      </w:r>
-      <w:r>
-        <w:rPr>
-          <w:rFonts w:ascii="Aptos" w:hAnsi="Aptos"/>
-          <w:sz w:val="22"/>
-          <w:szCs w:val="22"/>
-        </w:rPr>
-        <w:t>obre</w:t>
-      </w:r>
-      <w:r>
-        <w:rPr>
-          <w:rFonts w:ascii="Aptos" w:hAnsi="Aptos"/>
-          <w:sz w:val="22"/>
-          <w:szCs w:val="22"/>
-        </w:rPr>
-        <w:t xml:space="preserve"> </w:t>
-      </w:r>
-      <w:r>
-        <w:rPr>
-          <w:rFonts w:ascii="Aptos" w:hAnsi="Aptos"/>
-          <w:sz w:val="22"/>
-          <w:szCs w:val="22"/>
-        </w:rPr>
-        <w:t>m</w:t>
-      </w:r>
-      <w:r>
-        <w:rPr>
-          <w:rFonts w:ascii="Aptos" w:hAnsi="Aptos"/>
-          <w:sz w:val="22"/>
-          <w:szCs w:val="22"/>
-        </w:rPr>
-        <w:t>í</w:t>
-      </w:r>
-      <w:r>
-        <w:rPr>
-          <w:rFonts w:ascii="Aptos" w:hAnsi="Aptos"/>
-          <w:sz w:val="22"/>
-          <w:szCs w:val="22"/>
-        </w:rPr>
-        <w:t>,</w:t>
-      </w:r>
-      <w:r>
-        <w:rPr>
-          <w:rFonts w:ascii="Aptos" w:hAnsi="Aptos"/>
-          <w:sz w:val="22"/>
-          <w:szCs w:val="22"/>
-        </w:rPr>
-        <w:t xml:space="preserve"> Mis p</w:t>
-      </w:r>
-      <w:r>
-        <w:rPr>
-          <w:rFonts w:ascii="Aptos" w:hAnsi="Aptos"/>
-          <w:sz w:val="22"/>
-          <w:szCs w:val="22"/>
-        </w:rPr>
-        <w:t xml:space="preserve">royectos y </w:t>
-      </w:r>
-      <w:r>
-        <w:rPr>
-          <w:rFonts w:ascii="Aptos" w:hAnsi="Aptos"/>
-          <w:sz w:val="22"/>
-          <w:szCs w:val="22"/>
-        </w:rPr>
-        <w:t>C</w:t>
-      </w:r>
-      <w:r>
-        <w:rPr>
-          <w:rFonts w:ascii="Aptos" w:hAnsi="Aptos"/>
-          <w:sz w:val="22"/>
-          <w:szCs w:val="22"/>
-        </w:rPr>
-        <w:t>ontacto.</w:t>
-      </w:r>
-      <w:r>
-        <w:rPr>
-          <w:rFonts w:ascii="Aptos" w:hAnsi="Aptos"/>
-          <w:sz w:val="22"/>
-          <w:szCs w:val="22"/>
-        </w:rPr>
-        <w:t xml:space="preserve"> </w:t>
-      </w:r>
-      <w:r>
-        <w:rPr>
-          <w:rFonts w:ascii="Aptos" w:hAnsi="Aptos"/>
-          <w:sz w:val="22"/>
-          <w:szCs w:val="22"/>
-        </w:rPr>
-        <w:t>Todos los enlaces internos realizan un desplazamiento suave dentro del mismo HTML.</w:t>
-      </w:r>
-      <w:r>
-        <w:rPr>
-          <w:rFonts w:ascii="Aptos" w:hAnsi="Aptos"/>
-          <w:sz w:val="22"/>
-          <w:szCs w:val="22"/>
-        </w:rPr>
-        <w:t xml:space="preserve"> </w:t>
-      </w:r>
     </w:p>
     <w:p>
       <w:pPr>
@@ -470,31 +449,15 @@
           <w:sz w:val="22"/>
           <w:szCs w:val="22"/>
         </w:rPr>
-        <w:t xml:space="preserve"> </w:t>
-      </w:r>
-      <w:r>
-        <w:rPr>
-          <w:rFonts w:ascii="Aptos" w:hAnsi="Aptos"/>
-          <w:sz w:val="22"/>
-          <w:szCs w:val="22"/>
-        </w:rPr>
-        <w:t>En móvil, la navegación se convierte en un menú desplegable, pero conserva los mismos destinos y el mismo orden.</w:t>
-      </w:r>
-      <w:r>
-        <w:rPr>
-          <w:rFonts w:ascii="Aptos" w:hAnsi="Aptos"/>
-          <w:sz w:val="22"/>
-          <w:szCs w:val="22"/>
-        </w:rPr>
-        <w:t xml:space="preserve"> </w:t>
-      </w:r>
-      <w:r>
-        <w:rPr>
-          <w:rFonts w:ascii="Aptos" w:hAnsi="Aptos"/>
-          <w:sz w:val="22"/>
-          <w:szCs w:val="22"/>
-        </w:rPr>
-        <w:t>Las interacciones no deben impedir la lectura, la navegación con teclado ni el acceso a los enlaces.</w:t>
+        <w:t xml:space="preserve"> En móvil, la navegación se convierte en un menú desplegable, pero conserva los mismos destinos y el mismo orden.</w:t>
+      </w:r>
+      <w:r>
+        <w:rPr>
+          <w:rFonts w:ascii="Aptos" w:hAnsi="Aptos"/>
+          <w:sz w:val="22"/>
+          <w:szCs w:val="22"/>
+        </w:rPr>
+        <w:t xml:space="preserve"> Las interacciones no deben impedir la lectura, la navegación con teclado ni el acceso a los enlaces.</w:t>
       </w:r>
     </w:p>
     <w:p>
@@ -936,7 +899,31 @@
           <w:sz w:val="22"/>
           <w:szCs w:val="22"/>
         </w:rPr>
-        <w:t>Texto complementario: “Soy una persona curiosa y disfruto comprender el propósito detrás de cada proyecto. Para mí, el diseño consiste en configurar nuevas experiencias y medios; al experimentar con ideas, formas y movimiento es posible crear algo claro, útil y memorable”.</w:t>
+        <w:t xml:space="preserve">Texto complementario: “Soy una persona curiosa y disfruto comprender el propósito detrás de cada proyecto. Para mí, el diseño consiste en </w:t>
+      </w:r>
+      <w:r>
+        <w:rPr>
+          <w:rFonts w:ascii="Aptos" w:hAnsi="Aptos"/>
+          <w:sz w:val="22"/>
+          <w:szCs w:val="22"/>
+        </w:rPr>
+        <w:t xml:space="preserve">jugar con formas para llegar a un resultado </w:t>
+      </w:r>
+      <w:r>
+        <w:rPr>
+          <w:rFonts w:ascii="Aptos" w:hAnsi="Aptos"/>
+          <w:sz w:val="22"/>
+          <w:szCs w:val="22"/>
+        </w:rPr>
+        <w:t>que conecte con un mensaje específico</w:t>
+      </w:r>
+      <w:r>
+        <w:rPr>
+          <w:rFonts w:ascii="Aptos" w:hAnsi="Aptos"/>
+          <w:sz w:val="22"/>
+          <w:szCs w:val="22"/>
+        </w:rPr>
+        <w:t>”.</w:t>
       </w:r>
     </w:p>
     <w:p>
@@ -1308,14 +1295,6 @@
         </w:rPr>
         <w:t>Organización de información, flujos, interfaces y prototipos</w:t>
       </w:r>
-      <w:r>
-        <w:rPr>
-          <w:rFonts w:ascii="Aptos" w:hAnsi="Aptos"/>
-          <w:sz w:val="22"/>
-          <w:szCs w:val="22"/>
-        </w:rPr>
-        <w:t>.</w:t>
-      </w:r>
     </w:p>
     <w:p>
       <w:pPr>
@@ -1415,16 +1394,7 @@
           <w:sz w:val="22"/>
           <w:szCs w:val="22"/>
         </w:rPr>
-        <w:t>E</w:t>
-      </w:r>
-      <w:r>
-        <w:rPr>
-          <w:rFonts w:ascii="Aptos" w:eastAsia="Calibri" w:hAnsi="Aptos"/>
-          <w:color w:val="202225"/>
-          <w:sz w:val="22"/>
-          <w:szCs w:val="22"/>
-        </w:rPr>
-        <w:t>n escritorio, las tarjetas pueden arrastrarse como una secuencia continua. En móvil, se recorren mediante desplazamiento horizontal. La tarjeta activa debe poder abrirse también con teclado o toque.</w:t>
+        <w:t>En escritorio, las tarjetas pueden arrastrarse como una secuencia continua. En móvil, se recorren mediante desplazamiento horizontal. La tarjeta activa debe poder abrirse también con teclado o toque.</w:t>
       </w:r>
     </w:p>
     <w:p>
@@ -1684,7 +1654,7 @@
           <w:sz w:val="22"/>
           <w:szCs w:val="22"/>
         </w:rPr>
-        <w:t>Descripción breve del objetivo y del resultado.</w:t>
+        <w:t>Etiquetas relacionadas con disciplina, herramientas o entregables.</w:t>
       </w:r>
     </w:p>
     <w:p>
@@ -1706,28 +1676,6 @@
           <w:sz w:val="22"/>
           <w:szCs w:val="22"/>
         </w:rPr>
-        <w:t>Etiquetas relacionadas con disciplina, herramientas o entregables.</w:t>
-      </w:r>
-    </w:p>
-    <w:p>
-      <w:pPr>
-        <w:pStyle w:val="Prrafodelista"/>
-        <w:numPr>
-          <w:ilvl w:val="0"/>
-          <w:numId w:val="7"/>
-        </w:numPr>
-        <w:rPr>
-          <w:rFonts w:ascii="Aptos" w:hAnsi="Aptos"/>
-          <w:sz w:val="22"/>
-          <w:szCs w:val="22"/>
-        </w:rPr>
-      </w:pPr>
-      <w:r>
-        <w:rPr>
-          <w:rFonts w:ascii="Aptos" w:hAnsi="Aptos"/>
-          <w:sz w:val="22"/>
-          <w:szCs w:val="22"/>
-        </w:rPr>
         <w:t xml:space="preserve">Galería de imágenes y, cuando corresponda, video </w:t>
       </w:r>
       <w:r>
@@ -1753,7 +1701,39 @@
           <w:sz w:val="22"/>
           <w:szCs w:val="22"/>
         </w:rPr>
-        <w:t>La galería de cada proyecto se desplaza horizontalmente y conserva la proporción completa de las imágenes, sin recortarlas. En móvil se recorre con el dedo. Todo el contenido permanece dentro de #proyectos; no se generan archivos HTML adicionales ni páginas independientes para ampliar cada caso.</w:t>
+        <w:t xml:space="preserve">La galería de cada proyecto se desplaza horizontalmente </w:t>
+      </w:r>
+      <w:r>
+        <w:rPr>
+          <w:rFonts w:ascii="Aptos" w:hAnsi="Aptos"/>
+          <w:sz w:val="22"/>
+          <w:szCs w:val="22"/>
+        </w:rPr>
+        <w:t xml:space="preserve">al tamaño de casi la pantalla </w:t>
+      </w:r>
+      <w:r>
+        <w:rPr>
+          <w:rFonts w:ascii="Aptos" w:hAnsi="Aptos"/>
+          <w:sz w:val="22"/>
+          <w:szCs w:val="22"/>
+        </w:rPr>
+        <w:t xml:space="preserve">y conserva la proporción completa de las imágenes, sin recortarlas. En móvil se recorre con el dedo. Todo el contenido permanece dentro de </w:t>
+      </w:r>
+      <w:r>
+        <w:rPr>
+          <w:rFonts w:ascii="Aptos" w:hAnsi="Aptos"/>
+          <w:sz w:val="22"/>
+          <w:szCs w:val="22"/>
+        </w:rPr>
+        <w:t xml:space="preserve">Mis </w:t>
+      </w:r>
+      <w:r>
+        <w:rPr>
+          <w:rFonts w:ascii="Aptos" w:hAnsi="Aptos"/>
+          <w:sz w:val="22"/>
+          <w:szCs w:val="22"/>
+        </w:rPr>
+        <w:t>proyectos; no se generan archivos HTML adicionales ni páginas independientes para ampliar cada caso.</w:t>
       </w:r>
     </w:p>
     <w:p>
@@ -2204,15 +2184,39 @@
           <w:sz w:val="22"/>
           <w:szCs w:val="22"/>
         </w:rPr>
-        <w:t>morado oscuro que presenta nuevamente mi logo completo en su versión blanca</w:t>
-      </w:r>
-      <w:r>
-        <w:rPr>
-          <w:rFonts w:ascii="Aptos" w:hAnsi="Aptos"/>
-          <w:sz w:val="22"/>
-          <w:szCs w:val="22"/>
-        </w:rPr>
-        <w:t xml:space="preserve"> que al darle clic lleva a Inicio</w:t>
+        <w:t xml:space="preserve">morado oscuro que presenta nuevamente mi </w:t>
+      </w:r>
+      <w:r>
+        <w:rPr>
+          <w:rFonts w:ascii="Aptos" w:hAnsi="Aptos"/>
+          <w:sz w:val="22"/>
+          <w:szCs w:val="22"/>
+        </w:rPr>
+        <w:t>isotipo compatible</w:t>
+      </w:r>
+      <w:r>
+        <w:rPr>
+          <w:rFonts w:ascii="Aptos" w:hAnsi="Aptos"/>
+          <w:sz w:val="22"/>
+          <w:szCs w:val="22"/>
+        </w:rPr>
+        <w:t xml:space="preserve"> en su versión </w:t>
+      </w:r>
+      <w:r>
+        <w:rPr>
+          <w:rFonts w:ascii="Aptos" w:hAnsi="Aptos"/>
+          <w:sz w:val="22"/>
+          <w:szCs w:val="22"/>
+        </w:rPr>
+        <w:t xml:space="preserve">oscura </w:t>
+      </w:r>
+      <w:r>
+        <w:rPr>
+          <w:rFonts w:ascii="Aptos" w:hAnsi="Aptos"/>
+          <w:sz w:val="22"/>
+          <w:szCs w:val="22"/>
+        </w:rPr>
+        <w:t>que al darle clic lleva a Inicio</w:t>
       </w:r>
       <w:r>
         <w:rPr>
@@ -3507,6 +3511,7 @@
   <w:style w:type="character" w:default="1" w:styleId="Fuentedeprrafopredeter">
     <w:name w:val="Default Paragraph Font"/>
     <w:uiPriority w:val="1"/>
+    <w:semiHidden/>
     <w:unhideWhenUsed/>
   </w:style>
   <w:style w:type="table" w:default="1" w:styleId="Tablanormal">

</xml_diff>